<commit_message>
feat(viz): reemplazo de esquema mermaid con renderizado de alta fidelidad Pele de kepano (pieles V2 y V1)
</commit_message>
<xml_diff>
--- a/manuscrito.docx
+++ b/manuscrito.docx
@@ -3274,24 +3274,20 @@
           <w:bookmarkStart w:id="21" w:name="fig-arquitectura"/>
           <w:p>
             <w:pPr>
-              <w:jc w:val="center"/>
-            </w:pPr>
-          </w:p>
-          <w:p>
-            <w:pPr>
+              <w:pStyle w:val="Compact"/>
               <w:jc w:val="center"/>
             </w:pPr>
             <w:r>
               <w:drawing>
                 <wp:inline>
-                  <wp:extent cx="5334000" cy="3718136"/>
+                  <wp:extent cx="5334000" cy="5984748"/>
                   <wp:effectExtent b="0" l="0" r="0" t="0"/>
                   <wp:docPr descr="" title="" id="19" name="Picture"/>
                   <a:graphic>
                     <a:graphicData uri="http://schemas.openxmlformats.org/drawingml/2006/picture">
                       <pic:pic>
                         <pic:nvPicPr>
-                          <pic:cNvPr descr="manuscrito_files/figure-docx/mermaid-figure-1.png" id="20" name="Picture"/>
+                          <pic:cNvPr descr="figuras/fig01_arquitectura_desacoplada_pele.png" id="20" name="Picture"/>
                           <pic:cNvPicPr>
                             <a:picLocks noChangeArrowheads="1" noChangeAspect="1"/>
                           </pic:cNvPicPr>
@@ -3305,7 +3301,7 @@
                         <pic:spPr bwMode="auto">
                           <a:xfrm>
                             <a:off x="0" y="0"/>
-                            <a:ext cx="5334000" cy="3718136"/>
+                            <a:ext cx="5334000" cy="5984748"/>
                           </a:xfrm>
                           <a:prstGeom prst="rect">
                             <a:avLst/>
@@ -3323,11 +3319,6 @@
                 </wp:inline>
               </w:drawing>
             </w:r>
-          </w:p>
-          <w:p>
-            <w:pPr>
-              <w:jc w:val="center"/>
-            </w:pPr>
           </w:p>
           <w:p>
             <w:pPr>
@@ -3351,7 +3342,17 @@
               <w:t xml:space="preserve">Incendios_PY</w:t>
             </w:r>
             <w:r>
-              <w:t xml:space="preserve">: separación estricta entre la capa de Ignición Primaria Física y la capa de Propagación Táctica Local.</w:t>
+              <w:t xml:space="preserve">: separación estricta entre la capa de Ignición Primaria Física y la capa de Propagación Táctica Local, renderizada con tipografía y paleta editorial mediante Pele (</w:t>
+            </w:r>
+            <w:r>
+              <w:rPr>
+                <w:i/>
+                <w:iCs/>
+              </w:rPr>
+              <w:t xml:space="preserve">obsidianmd/pele</w:t>
+            </w:r>
+            <w:r>
+              <w:t xml:space="preserve">).</w:t>
             </w:r>
           </w:p>
           <w:bookmarkEnd w:id="21"/>

</xml_diff>

<commit_message>
feat(viz): generador 100% automatizado en Python de figura cientifica de alto impacto (estilo Nature/Elsevier Q1) y actualizacion del manuscrito
</commit_message>
<xml_diff>
--- a/manuscrito.docx
+++ b/manuscrito.docx
@@ -3280,14 +3280,14 @@
             <w:r>
               <w:drawing>
                 <wp:inline>
-                  <wp:extent cx="5334000" cy="5984748"/>
+                  <wp:extent cx="5334000" cy="2206591"/>
                   <wp:effectExtent b="0" l="0" r="0" t="0"/>
                   <wp:docPr descr="" title="" id="19" name="Picture"/>
                   <a:graphic>
                     <a:graphicData uri="http://schemas.openxmlformats.org/drawingml/2006/picture">
                       <pic:pic>
                         <pic:nvPicPr>
-                          <pic:cNvPr descr="figuras/fig01_arquitectura_desacoplada_pele.png" id="20" name="Picture"/>
+                          <pic:cNvPr descr="figuras/fig01_arquitectura_impacto_nature.png" id="20" name="Picture"/>
                           <pic:cNvPicPr>
                             <a:picLocks noChangeArrowheads="1" noChangeAspect="1"/>
                           </pic:cNvPicPr>
@@ -3301,7 +3301,7 @@
                         <pic:spPr bwMode="auto">
                           <a:xfrm>
                             <a:off x="0" y="0"/>
-                            <a:ext cx="5334000" cy="5984748"/>
+                            <a:ext cx="5334000" cy="2206591"/>
                           </a:xfrm>
                           <a:prstGeom prst="rect">
                             <a:avLst/>
@@ -3330,7 +3330,7 @@
               <w:pStyle w:val="ImageCaption"/>
             </w:pPr>
             <w:r>
-              <w:t xml:space="preserve">Figura 1: Arquitectura computacional desacoplada de</w:t>
+              <w:t xml:space="preserve">Figura 1: Decoupled computational architecture of</w:t>
             </w:r>
             <w:r>
               <w:t xml:space="preserve"> </w:t>
@@ -3342,17 +3342,7 @@
               <w:t xml:space="preserve">Incendios_PY</w:t>
             </w:r>
             <w:r>
-              <w:t xml:space="preserve">: separación estricta entre la capa de Ignición Primaria Física y la capa de Propagación Táctica Local, renderizada con tipografía y paleta editorial mediante Pele (</w:t>
-            </w:r>
-            <w:r>
-              <w:rPr>
-                <w:i/>
-                <w:iCs/>
-              </w:rPr>
-              <w:t xml:space="preserve">obsidianmd/pele</w:t>
-            </w:r>
-            <w:r>
-              <w:t xml:space="preserve">).</w:t>
+              <w:t xml:space="preserve">: Multisource biophysical ingestion, Stage-1 kinematic gating, decoupled dual GeoAI modeling (Mode 1 Ignition vs. Mode 2 Tactical Propagation), and international benchmarking against Canadian FWI and INPE.</w:t>
             </w:r>
           </w:p>
           <w:bookmarkEnd w:id="21"/>

</xml_diff>

<commit_message>
fix(viz): resolucion de superposicion de mapa en Panel 1 y 3 mediante GridSpec anidado
</commit_message>
<xml_diff>
--- a/manuscrito.docx
+++ b/manuscrito.docx
@@ -3280,7 +3280,7 @@
             <w:r>
               <w:drawing>
                 <wp:inline>
-                  <wp:extent cx="5334000" cy="2206591"/>
+                  <wp:extent cx="5334000" cy="2335306"/>
                   <wp:effectExtent b="0" l="0" r="0" t="0"/>
                   <wp:docPr descr="" title="" id="19" name="Picture"/>
                   <a:graphic>
@@ -3301,7 +3301,7 @@
                         <pic:spPr bwMode="auto">
                           <a:xfrm>
                             <a:off x="0" y="0"/>
-                            <a:ext cx="5334000" cy="2206591"/>
+                            <a:ext cx="5334000" cy="2335306"/>
                           </a:xfrm>
                           <a:prstGeom prst="rect">
                             <a:avLst/>

</xml_diff>

<commit_message>
docs(bib): expand references to 44 canonical citations complying with Q1 Elsevier standards in Earth Sciences and GeoAI
</commit_message>
<xml_diff>
--- a/manuscrito.docx
+++ b/manuscrito.docx
@@ -685,7 +685,7 @@
         <w:t xml:space="preserve"> </w:t>
       </w:r>
       <w:r>
-        <w:t xml:space="preserve">(Baumann et al., 2017; Jolly et al., 2015)</w:t>
+        <w:t xml:space="preserve">(Baumann et al., 2017; Flannigan et al., 2009; Jolly et al., 2015)</w:t>
       </w:r>
       <w:r>
         <w:t xml:space="preserve">. La región del</w:t>
@@ -704,21 +704,24 @@
         <w:t xml:space="preserve"> </w:t>
       </w:r>
       <w:r>
-        <w:t xml:space="preserve">—el segundo bioma boscoso más extenso del continente tras la Amazonía— experimenta tasas aceleradas de deforestación y cambio de uso de suelo asociadas a la expansión agrícola y ganadera</w:t>
-      </w:r>
-      <w:r>
-        <w:t xml:space="preserve"> </w:t>
-      </w:r>
-      <w:r>
-        <w:t xml:space="preserve">(Vallejos et al., 2015)</w:t>
-      </w:r>
-      <w:r>
-        <w:t xml:space="preserve">. En este contexto, el uso del fuego como herramienta de limpieza de campos, combinado con sequías sinópticas prolongadas y temperaturas que superan rutinariamente los</w:t>
-      </w:r>
-      <w:r>
-        <w:t xml:space="preserve"> </w:t>
+        <w:t xml:space="preserve">—el segundo bioma boscoso más extenso del continente tras la Amazonía— experimenta transformaciones de cobertura y cambio de uso de suelo aceleradas por la frontera agropecuaria</w:t>
+      </w:r>
+      <w:r>
+        <w:t xml:space="preserve"> </w:t>
+      </w:r>
+      <w:r>
+        <w:t xml:space="preserve">(Alvarado et al., 2018; Vallejos et al., 2015)</w:t>
+      </w:r>
+      <w:r>
+        <w:t xml:space="preserve">. En este mosaico ecológico, las prácticas tradicionales de desmonte y quema de pasturas, combinadas con sequías sinópticas recurrentes y temperaturas extremas (</w:t>
       </w:r>
       <m:oMath>
+        <m:r>
+          <m:rPr>
+            <m:sty m:val="p"/>
+          </m:rPr>
+          <m:t>&gt;</m:t>
+        </m:r>
         <m:sSup>
           <m:e>
             <m:r>
@@ -743,7 +746,16 @@
         </m:r>
       </m:oMath>
       <w:r>
-        <w:t xml:space="preserve">, genera incendios incontrolados de escala catastrófica, como los eventos récord observados en 2019, 2020 y 2024.</w:t>
+        <w:t xml:space="preserve">), desatan conflagraciones de escala catastrófica similares a las registradas en biomas vecinos del Pantanal y Cerrado</w:t>
+      </w:r>
+      <w:r>
+        <w:t xml:space="preserve"> </w:t>
+      </w:r>
+      <w:r>
+        <w:t xml:space="preserve">(Pivello et al., 2021)</w:t>
+      </w:r>
+      <w:r>
+        <w:t xml:space="preserve">, con temporadas críticas sin precedentes en 2019, 2020 y 2024.</w:t>
       </w:r>
     </w:p>
     <w:p>
@@ -751,7 +763,16 @@
         <w:pStyle w:val="BodyText"/>
       </w:pPr>
       <w:r>
-        <w:t xml:space="preserve">A nivel internacional, la estimación del peligro de incendios se ha sustentado tradicionalmente en sistemas empíricos semi-mecanicistas formulados hace décadas. Entre ellos, el sistema canadiense</w:t>
+        <w:t xml:space="preserve">A nivel internacional, la estimación del peligro y propagación de incendios se ha sustentado históricamente en dos vertientes: los modelos mecanicistas basados en balances térmicos y dinámica de fluidos de combustibles vegetales</w:t>
+      </w:r>
+      <w:r>
+        <w:t xml:space="preserve"> </w:t>
+      </w:r>
+      <w:r>
+        <w:t xml:space="preserve">(Andrews, 2014; Rothermel, 1972)</w:t>
+      </w:r>
+      <w:r>
+        <w:t xml:space="preserve">, y los sistemas empíricos semi-mecanicistas de peligro meteorológico. Entre estos últimos, el sistema canadiense</w:t>
       </w:r>
       <w:r>
         <w:t xml:space="preserve"> </w:t>
@@ -779,7 +800,7 @@
         <w:t xml:space="preserve"> </w:t>
       </w:r>
       <w:r>
-        <w:t xml:space="preserve">constituye el estándar operativo adoptado por el sistema europeo EFFIS (</w:t>
+        <w:t xml:space="preserve">constituye el estándar adoptado por el sistema europeo EFFIS (</w:t>
       </w:r>
       <w:r>
         <w:rPr>
@@ -798,7 +819,40 @@
         <w:t xml:space="preserve">(San-Miguel-Ayanz et al., 2012)</w:t>
       </w:r>
       <w:r>
-        <w:t xml:space="preserve">. De forma paralela, en Sudamérica el</w:t>
+        <w:t xml:space="preserve">. Con la consolidación de la teledetección satelital de incendios activos —iniciada por MODIS</w:t>
+      </w:r>
+      <w:r>
+        <w:t xml:space="preserve"> </w:t>
+      </w:r>
+      <w:r>
+        <w:t xml:space="preserve">(Giglio et al., 2016; Justice et al., 2002)</w:t>
+      </w:r>
+      <w:r>
+        <w:t xml:space="preserve"> </w:t>
+      </w:r>
+      <w:r>
+        <w:t xml:space="preserve">y continuada por VIIRS</w:t>
+      </w:r>
+      <w:r>
+        <w:t xml:space="preserve"> </w:t>
+      </w:r>
+      <w:r>
+        <w:t xml:space="preserve">(Schroeder et al., 2014)</w:t>
+      </w:r>
+      <w:r>
+        <w:t xml:space="preserve"> </w:t>
+      </w:r>
+      <w:r>
+        <w:t xml:space="preserve">junto con productos multidecenales de área quemada</w:t>
+      </w:r>
+      <w:r>
+        <w:t xml:space="preserve"> </w:t>
+      </w:r>
+      <w:r>
+        <w:t xml:space="preserve">(Artés et al., 2019; Chuvieco et al., 2019; Roy et al., 2008)</w:t>
+      </w:r>
+      <w:r>
+        <w:t xml:space="preserve">—, en Sudamérica el</w:t>
       </w:r>
       <w:r>
         <w:t xml:space="preserve"> </w:t>
@@ -833,7 +887,7 @@
         <w:t xml:space="preserve">(Setzer et al., 2019)</w:t>
       </w:r>
       <w:r>
-        <w:t xml:space="preserve">, ampliamente utilizado por las agencias ambientales de Paraguay (MADES e INFONA). Sin embargo, estos índices canónicos fueron calibrados predominantemente para coníferas boreales templadas o para el Cerrado brasileño, exhibiendo graves deficiencias de calibración cuando se extrapolan al régimen hídrico semiárido del Chaco Seco o a la transición con el Bosque Atlántico húmedo.</w:t>
+        <w:t xml:space="preserve">, ampliamente empleado por los organismos ambientales de Paraguay (MADES e INFONA). No obstante, estos índices canónicos fueron formulados para bosques templados de coníferas o sabanas tropicales abiertas, mostrando serias inconsistencias de calibración al extrapolarse a biomas xerofíticos bajo déficit hídrico extremo como el Chaco Seco.</w:t>
       </w:r>
     </w:p>
     <w:p>
@@ -841,36 +895,75 @@
         <w:pStyle w:val="BodyText"/>
       </w:pPr>
       <w:r>
-        <w:t xml:space="preserve">El advenimiento del aprendizaje automático (</w:t>
+        <w:t xml:space="preserve">El auge de la inteligencia artificial geoespacial (</w:t>
       </w:r>
       <w:r>
         <w:rPr>
           <w:i/>
           <w:iCs/>
         </w:rPr>
-        <w:t xml:space="preserve">Machine Learning</w:t>
-      </w:r>
-      <w:r>
-        <w:t xml:space="preserve">) y la inteligencia artificial geoespacial (</w:t>
+        <w:t xml:space="preserve">GeoAI</w:t>
+      </w:r>
+      <w:r>
+        <w:t xml:space="preserve">) y el aprendizaje automático (</w:t>
       </w:r>
       <w:r>
         <w:rPr>
           <w:i/>
           <w:iCs/>
         </w:rPr>
-        <w:t xml:space="preserve">GeoAI</w:t>
-      </w:r>
-      <w:r>
-        <w:t xml:space="preserve">) ha impulsado una proliferación de modelos basados en árboles potenciados por gradiente (GBDT) y redes neuronales profundas para la predicción de fuegos</w:t>
-      </w:r>
-      <w:r>
-        <w:t xml:space="preserve"> </w:t>
-      </w:r>
-      <w:r>
-        <w:t xml:space="preserve">(Chen &amp; Guestrin, 2016; Ke et al., 2017)</w:t>
-      </w:r>
-      <w:r>
-        <w:t xml:space="preserve">. No obstante, una revisión crítica de la literatura revela dos patologías metodológicas persistentes:</w:t>
+        <w:t xml:space="preserve">Machine Learning</w:t>
+      </w:r>
+      <w:r>
+        <w:t xml:space="preserve">) ha propiciado una amplia gama de algoritmos de detección temprana y modelado predictivo de ignición</w:t>
+      </w:r>
+      <w:r>
+        <w:t xml:space="preserve"> </w:t>
+      </w:r>
+      <w:r>
+        <w:t xml:space="preserve">(Barmpoutis et al., 2020; Jain et al., 2020)</w:t>
+      </w:r>
+      <w:r>
+        <w:t xml:space="preserve">, predominantemente mediante ensambles de árboles de decisión como XGBoost</w:t>
+      </w:r>
+      <w:r>
+        <w:t xml:space="preserve"> </w:t>
+      </w:r>
+      <w:r>
+        <w:t xml:space="preserve">(Chen &amp; Guestrin, 2016)</w:t>
+      </w:r>
+      <w:r>
+        <w:t xml:space="preserve">, LightGBM</w:t>
+      </w:r>
+      <w:r>
+        <w:t xml:space="preserve"> </w:t>
+      </w:r>
+      <w:r>
+        <w:t xml:space="preserve">(Ke et al., 2017)</w:t>
+      </w:r>
+      <w:r>
+        <w:t xml:space="preserve"> </w:t>
+      </w:r>
+      <w:r>
+        <w:t xml:space="preserve">y CatBoost</w:t>
+      </w:r>
+      <w:r>
+        <w:t xml:space="preserve"> </w:t>
+      </w:r>
+      <w:r>
+        <w:t xml:space="preserve">(Prokhorenkova et al., 2018)</w:t>
+      </w:r>
+      <w:r>
+        <w:t xml:space="preserve">, así como clasificadores biofísicos</w:t>
+      </w:r>
+      <w:r>
+        <w:t xml:space="preserve"> </w:t>
+      </w:r>
+      <w:r>
+        <w:t xml:space="preserve">(Coffield et al., 2019; Rodrigues &amp; Riva, 2014; Sayad et al., 2019)</w:t>
+      </w:r>
+      <w:r>
+        <w:t xml:space="preserve">. Sin embargo, la integración acrítica de estos métodos en geociencias enfrenta dos patologías metodológicas persistentes:</w:t>
       </w:r>
     </w:p>
     <w:p>
@@ -902,42 +995,26 @@
           <w:b/>
           <w:bCs/>
         </w:rPr>
-        <w:t xml:space="preserve">) y la fuga de datos (</w:t>
-      </w:r>
-      <w:r>
-        <w:rPr>
-          <w:b/>
-          <w:bCs/>
+        <w:t xml:space="preserve">) y la violación de independencia:</w:t>
+      </w:r>
+      <w:r>
+        <w:br/>
+      </w:r>
+      <w:r>
+        <w:t xml:space="preserve">Cuando un modelo de machine learning incluye covariables espaciales autorregresivas contiguas (distancia al fuego de la jornada anterior, densidad de focos térmicos adyacentes) sin aislar el mecanismo causante, el algoritmo sucumbe a un atajo espurio: aprende que</w:t>
+      </w:r>
+      <w:r>
+        <w:t xml:space="preserve"> </w:t>
+      </w:r>
+      <w:r>
+        <w:rPr>
           <w:i/>
           <w:iCs/>
         </w:rPr>
-        <w:t xml:space="preserve">Data Leakage</w:t>
-      </w:r>
-      <w:r>
-        <w:rPr>
-          <w:b/>
-          <w:bCs/>
-        </w:rPr>
-        <w:t xml:space="preserve">):</w:t>
-      </w:r>
-      <w:r>
-        <w:br/>
-      </w:r>
-      <w:r>
-        <w:t xml:space="preserve">Cuando un modelo de machine learning incluye variables espaciales autorregresivas contiguas (distancia al fuego del día anterior, densidad local de focos térmicos) sin desacoplar el origen del evento, el algoritmo aprende que</w:t>
-      </w:r>
-      <w:r>
-        <w:t xml:space="preserve"> </w:t>
-      </w:r>
-      <w:r>
-        <w:rPr>
-          <w:i/>
-          <w:iCs/>
-        </w:rPr>
-        <w:t xml:space="preserve">“si hay fuego al lado, hoy habrá fuego”</w:t>
-      </w:r>
-      <w:r>
-        <w:t xml:space="preserve">. Aunque esto genera métricas de validación infladas artificialmente (ROC-AUC</w:t>
+        <w:t xml:space="preserve">“si hay fuego al lado, hoy continuará el fuego”</w:t>
+      </w:r>
+      <w:r>
+        <w:t xml:space="preserve">. Aunque esta correlación infla artificialmente las métricas de prueba estándar (ROC-AUC</w:t>
       </w:r>
       <w:r>
         <w:t xml:space="preserve"> </w:t>
@@ -963,7 +1040,7 @@
         </m:r>
       </m:oMath>
       <w:r>
-        <w:t xml:space="preserve">), el modelo se vuelve completamente ciego ante</w:t>
+        <w:t xml:space="preserve">), el modelo se vuelve impotente para predecir</w:t>
       </w:r>
       <w:r>
         <w:t xml:space="preserve"> </w:t>
@@ -979,13 +1056,34 @@
         <w:t xml:space="preserve"> </w:t>
       </w:r>
       <w:r>
-        <w:t xml:space="preserve">en zonas de alto estrés hídrico donde ayer no había fuego</w:t>
+        <w:t xml:space="preserve">en áreas bajo estrés hídrico extremo donde ayer no existía combustión</w:t>
       </w:r>
       <w:r>
         <w:t xml:space="preserve"> </w:t>
       </w:r>
       <w:r>
         <w:t xml:space="preserve">(Ploton et al., 2020; Roberts et al., 2017)</w:t>
+      </w:r>
+      <w:r>
+        <w:t xml:space="preserve">. Esta patología ignora los principios de la primera ley de la geografía</w:t>
+      </w:r>
+      <w:r>
+        <w:t xml:space="preserve"> </w:t>
+      </w:r>
+      <w:r>
+        <w:t xml:space="preserve">(Tobler, 1970)</w:t>
+      </w:r>
+      <w:r>
+        <w:t xml:space="preserve"> </w:t>
+      </w:r>
+      <w:r>
+        <w:t xml:space="preserve">y los desafíos bien documentados de la autocorrelación espacial en modelado ecológico</w:t>
+      </w:r>
+      <w:r>
+        <w:t xml:space="preserve"> </w:t>
+      </w:r>
+      <w:r>
+        <w:t xml:space="preserve">(Dormann et al., 2007; Legendre, 1993; Meyer &amp; Pebesma, 2021)</w:t>
       </w:r>
       <w:r>
         <w:t xml:space="preserve">.</w:t>
@@ -1004,13 +1102,54 @@
           <w:b/>
           <w:bCs/>
         </w:rPr>
+        <w:t xml:space="preserve">La disociación entre conocimiento físico y modelos de caja negra:</w:t>
+      </w:r>
+      <w:r>
+        <w:br/>
+      </w:r>
+      <w:r>
+        <w:t xml:space="preserve">Frecuentemente los modelos predictivos puramente estadísticos omiten restricciones cinemáticas elementales (e.g., combustión imposible bajo lluvia torrencial o ausencia total de biomasa combustible), lo que ha motivado el paradigma emergente de aprendizaje automático informado por la física (</w:t>
+      </w:r>
+      <w:r>
+        <w:rPr>
+          <w:i/>
+          <w:iCs/>
+        </w:rPr>
+        <w:t xml:space="preserve">Physics-Informed Machine Learning</w:t>
+      </w:r>
+      <w:r>
+        <w:t xml:space="preserve">, PIML) en ciencias de la Tierra</w:t>
+      </w:r>
+      <w:r>
+        <w:t xml:space="preserve"> </w:t>
+      </w:r>
+      <w:r>
+        <w:t xml:space="preserve">(Reichstein et al., 2019; Willard et al., 2022)</w:t>
+      </w:r>
+      <w:r>
+        <w:t xml:space="preserve">.</w:t>
+      </w:r>
+    </w:p>
+    <w:p>
+      <w:pPr>
+        <w:pStyle w:val="Compact"/>
+        <w:numPr>
+          <w:ilvl w:val="0"/>
+          <w:numId w:val="1001"/>
+        </w:numPr>
+      </w:pPr>
+      <w:r>
+        <w:rPr>
+          <w:b/>
+          <w:bCs/>
+        </w:rPr>
         <w:t xml:space="preserve">La ineficiencia computacional para la alerta operativa diaria:</w:t>
       </w:r>
       <w:r>
         <w:br/>
       </w:r>
       <w:r>
-        <w:t xml:space="preserve">Muchos modelos académicos dependen de flujos de trabajo fragmentados en software SIG de escritorio o rutinas pesadas de geoprocesamiento espacial, lo que impide su ejecución automatizada y reproducible a escala de país a resolución de 1 km² en cuestión de segundos.</w:t>
+        <w:t xml:space="preserve">Muchos modelos académicos dependen de secuencias manuales en software SIG de escritorio o rutinas pesadas de geoprocesamiento ráster, impidiendo su despliegue automatizado y soberano a escala de país a resolución de 1 km² en tiempo subsegundo.</w:t>
       </w:r>
     </w:p>
     <w:p>
@@ -1390,7 +1529,16 @@
         <w:t xml:space="preserve">Fine Fuel Moisture Code</w:t>
       </w:r>
       <w:r>
-        <w:t xml:space="preserve">, FFMC). El balance de humedad entre el combustible vegetal y la atmósfera circundante depende críticamente del déficit de presión de vapor (</w:t>
+        <w:t xml:space="preserve">, FFMC) y la dinámica de transferencia de calor en el lecho de combustible</w:t>
+      </w:r>
+      <w:r>
+        <w:t xml:space="preserve"> </w:t>
+      </w:r>
+      <w:r>
+        <w:t xml:space="preserve">(Flannigan et al., 2016; Rothermel, 1972)</w:t>
+      </w:r>
+      <w:r>
+        <w:t xml:space="preserve">. El balance de humedad entre el combustible vegetal y la atmósfera circundante depende críticamente del déficit de presión de vapor (</w:t>
       </w:r>
       <m:oMath>
         <m:r>
@@ -2288,7 +2436,26 @@
         <w:t xml:space="preserve"> </w:t>
       </w:r>
       <w:r>
-        <w:t xml:space="preserve">millones de combinaciones en 10 años), definimos una función indicadora binaria de viabilidad biofísica</w:t>
+        <w:t xml:space="preserve">millones de combinaciones en 10 años), implementamos una restricción cinemática inspirada en los principios de aprendizaje automático guiado por la física (</w:t>
+      </w:r>
+      <w:r>
+        <w:rPr>
+          <w:i/>
+          <w:iCs/>
+        </w:rPr>
+        <w:t xml:space="preserve">Physics-Guided Machine Learning</w:t>
+      </w:r>
+      <w:r>
+        <w:t xml:space="preserve">)</w:t>
+      </w:r>
+      <w:r>
+        <w:t xml:space="preserve"> </w:t>
+      </w:r>
+      <w:r>
+        <w:t xml:space="preserve">(Reichstein et al., 2019; Willard et al., 2022)</w:t>
+      </w:r>
+      <w:r>
+        <w:t xml:space="preserve">. Definimos una función indicadora binaria de viabilidad biofísica</w:t>
       </w:r>
       <w:r>
         <w:t xml:space="preserve"> </w:t>
@@ -2744,7 +2911,16 @@
         <w:t xml:space="preserve"> </w:t>
       </w:r>
       <w:r>
-        <w:t xml:space="preserve">para cuerpos de agua, humedales permanentes y zonas urbanas impermeabilizadas según MapBiomas, y</w:t>
+        <w:t xml:space="preserve">para cuerpos de agua, humedales permanentes y zonas urbanas impermeabilizadas según MapBiomas</w:t>
+      </w:r>
+      <w:r>
+        <w:t xml:space="preserve"> </w:t>
+      </w:r>
+      <w:r>
+        <w:t xml:space="preserve">(MapBiomas Chaco, 2023)</w:t>
+      </w:r>
+      <w:r>
+        <w:t xml:space="preserve">, y</w:t>
       </w:r>
       <w:r>
         <w:t xml:space="preserve"> </w:t>
@@ -4237,7 +4413,30 @@
         <w:pStyle w:val="FirstParagraph"/>
       </w:pPr>
       <w:r>
-        <w:t xml:space="preserve">Adicionalmente, formalizamos el</w:t>
+        <w:t xml:space="preserve">donde la potencia radiativa del fuego (</w:t>
+      </w:r>
+      <m:oMath>
+        <m:r>
+          <m:t>F</m:t>
+        </m:r>
+        <m:r>
+          <m:t>R</m:t>
+        </m:r>
+        <m:r>
+          <m:t>P</m:t>
+        </m:r>
+      </m:oMath>
+      <w:r>
+        <w:t xml:space="preserve">) cuantifica la tasa instantánea de energía liberada por la biomasa en combustión</w:t>
+      </w:r>
+      <w:r>
+        <w:t xml:space="preserve"> </w:t>
+      </w:r>
+      <w:r>
+        <w:t xml:space="preserve">(Wooster et al., 2005)</w:t>
+      </w:r>
+      <w:r>
+        <w:t xml:space="preserve">. Adicionalmente, formalizamos el</w:t>
       </w:r>
       <w:r>
         <w:t xml:space="preserve"> </w:t>
@@ -5241,6 +5440,15 @@
         <w:t xml:space="preserve">(Schroeder et al., 2014)</w:t>
       </w:r>
       <w:r>
+        <w:t xml:space="preserve">, que extienden las series históricas iniciadas por MODIS</w:t>
+      </w:r>
+      <w:r>
+        <w:t xml:space="preserve"> </w:t>
+      </w:r>
+      <w:r>
+        <w:t xml:space="preserve">(Giglio et al., 2016; Justice et al., 2002)</w:t>
+      </w:r>
+      <w:r>
         <w:t xml:space="preserve">. Para garantizar la integridad de las etiquetas de entrenamiento, aplicamos un protocolo de depuración óptica en dos pasos:</w:t>
       </w:r>
     </w:p>
@@ -5545,7 +5753,28 @@
         <w:pStyle w:val="FirstParagraph"/>
       </w:pPr>
       <w:r>
-        <w:t xml:space="preserve">Para procesar la serie multianual sin desbordamiento de memoria RAM en hardware estándar, implementamos el pipeline mediante</w:t>
+        <w:t xml:space="preserve">A diferencia de las plataformas centralizadas en la nube como Google Earth Engine</w:t>
+      </w:r>
+      <w:r>
+        <w:t xml:space="preserve"> </w:t>
+      </w:r>
+      <w:r>
+        <w:t xml:space="preserve">(Gorelick et al., 2017)</w:t>
+      </w:r>
+      <w:r>
+        <w:t xml:space="preserve">, que dependen de conectividad permanente a servidores remotos, o de librerías tradicionales en memoria como Scikit-learn</w:t>
+      </w:r>
+      <w:r>
+        <w:t xml:space="preserve"> </w:t>
+      </w:r>
+      <w:r>
+        <w:t xml:space="preserve">(Pedregosa et al., 2011)</w:t>
+      </w:r>
+      <w:r>
+        <w:t xml:space="preserve"> </w:t>
+      </w:r>
+      <w:r>
+        <w:t xml:space="preserve">que duplican matrices densas, implementamos una canalización local de alto rendimiento mediante</w:t>
       </w:r>
       <w:r>
         <w:t xml:space="preserve"> </w:t>
@@ -6470,7 +6699,28 @@
         <w:pStyle w:val="FirstParagraph"/>
       </w:pPr>
       <w:r>
-        <w:t xml:space="preserve">Dado que la autocorrelación espacial de los incendios forestales puede extenderse a lo largo de decenas de kilómetros debido al transporte advectivo de columnas de humo y frentes de ráfagas, el muestreo aleatorio estándar de ausencias genera falsos negativos contaminados (</w:t>
+        <w:t xml:space="preserve">Dado que la autocorrelación espacial de los incendios forestales se propaga a lo largo de decenas de kilómetros por transporte advectivo de pavesas, columnas de convección y frentes de ráfagas —en concordancia directa con la primera ley de la geografía</w:t>
+      </w:r>
+      <w:r>
+        <w:t xml:space="preserve"> </w:t>
+      </w:r>
+      <w:r>
+        <w:t xml:space="preserve">(Tobler, 1970)</w:t>
+      </w:r>
+      <w:r>
+        <w:t xml:space="preserve"> </w:t>
+      </w:r>
+      <w:r>
+        <w:t xml:space="preserve">y los principios de dependencia espacial en ecología cuantitativa</w:t>
+      </w:r>
+      <w:r>
+        <w:t xml:space="preserve"> </w:t>
+      </w:r>
+      <w:r>
+        <w:t xml:space="preserve">(Dormann et al., 2007; Legendre, 1993)</w:t>
+      </w:r>
+      <w:r>
+        <w:t xml:space="preserve">—, el muestreo aleatorio uniforme de ausencias genera falsos negativos contaminados (</w:t>
       </w:r>
       <w:r>
         <w:rPr>
@@ -6483,7 +6733,7 @@
         <w:t xml:space="preserve"> </w:t>
       </w:r>
       <w:r>
-        <w:t xml:space="preserve">por proximidad).</w:t>
+        <w:t xml:space="preserve">por proximidad geográfica).</w:t>
       </w:r>
     </w:p>
     <w:p>
@@ -6491,25 +6741,13 @@
         <w:pStyle w:val="BodyText"/>
       </w:pPr>
       <w:r>
-        <w:t xml:space="preserve">Siguiendo las recomendaciones de</w:t>
-      </w:r>
-      <w:r>
-        <w:t xml:space="preserve"> </w:t>
-      </w:r>
-      <w:r>
-        <w:t xml:space="preserve">Roberts et al. (2017)</w:t>
-      </w:r>
-      <w:r>
-        <w:t xml:space="preserve"> </w:t>
-      </w:r>
-      <w:r>
-        <w:t xml:space="preserve">y</w:t>
-      </w:r>
-      <w:r>
-        <w:t xml:space="preserve"> </w:t>
-      </w:r>
-      <w:r>
-        <w:t xml:space="preserve">Ploton et al. (2020)</w:t>
+        <w:t xml:space="preserve">Para garantizar una evaluación rigurosa del área de aplicabilidad del modelo y evitar métricas sobreajustadas</w:t>
+      </w:r>
+      <w:r>
+        <w:t xml:space="preserve"> </w:t>
+      </w:r>
+      <w:r>
+        <w:t xml:space="preserve">(Meyer &amp; Pebesma, 2021; Ploton et al., 2020; Roberts et al., 2017)</w:t>
       </w:r>
       <w:r>
         <w:t xml:space="preserve">, implementamos una</w:t>
@@ -6641,7 +6879,16 @@
         <w:t xml:space="preserve"> </w:t>
       </w:r>
       <w:r>
-        <w:t xml:space="preserve">en competencia directa contra tres sistemas alternativos sobre el conjunto ciego de prueba:</w:t>
+        <w:t xml:space="preserve">en competencia directa contra los sistemas canónicos internacionales y las líneas base metodológicas reportadas en la literatura de incendios forestales</w:t>
+      </w:r>
+      <w:r>
+        <w:t xml:space="preserve"> </w:t>
+      </w:r>
+      <w:r>
+        <w:t xml:space="preserve">(Jain et al., 2020; Rodrigues &amp; Riva, 2014; Sayad et al., 2019)</w:t>
+      </w:r>
+      <w:r>
+        <w:t xml:space="preserve">:</w:t>
       </w:r>
     </w:p>
     <w:p>
@@ -10394,7 +10641,7 @@
         <w:t xml:space="preserve"> </w:t>
       </w:r>
       <w:r>
-        <w:t xml:space="preserve">(Van Wagner, 1987)</w:t>
+        <w:t xml:space="preserve">(Flannigan et al., 2009; Van Wagner, 1987)</w:t>
       </w:r>
       <w:r>
         <w:t xml:space="preserve">.</w:t>
@@ -10405,7 +10652,16 @@
         <w:pStyle w:val="BodyText"/>
       </w:pPr>
       <w:r>
-        <w:t xml:space="preserve">En el Gran Chaco, el régimen del fuego es radicalmente distinto:</w:t>
+        <w:t xml:space="preserve">En el Gran Chaco y en mosaicos ecológicos análogos del Cerrado y Pantanal</w:t>
+      </w:r>
+      <w:r>
+        <w:t xml:space="preserve"> </w:t>
+      </w:r>
+      <w:r>
+        <w:t xml:space="preserve">(Alvarado et al., 2018; Pivello et al., 2021)</w:t>
+      </w:r>
+      <w:r>
+        <w:t xml:space="preserve">, el régimen del fuego es radicalmente distinto:</w:t>
       </w:r>
       <w:r>
         <w:t xml:space="preserve"> </w:t>
@@ -10503,85 +10759,17 @@
         <w:pStyle w:val="FirstParagraph"/>
       </w:pPr>
       <w:r>
-        <w:t xml:space="preserve">La literatura de machine learning aplicado al fuego abunda en publicaciones que reportan precisiones superiores al 95 % utilizando modelos únicos que mezclan variables meteorológicas con la distancia a focos del día anterior. Nuestro estudio demuestra que esos modelos sufren de</w:t>
-      </w:r>
-      <w:r>
-        <w:t xml:space="preserve"> </w:t>
-      </w:r>
-      <w:r>
-        <w:rPr>
-          <w:b/>
-          <w:bCs/>
-        </w:rPr>
-        <w:t xml:space="preserve">ceguera selectiva ante la ignición primaria</w:t>
-      </w:r>
-      <w:r>
-        <w:t xml:space="preserve">: cuando se elimina el atajo del fuego anterior, su precisión colapsa.</w:t>
-      </w:r>
-    </w:p>
-    <w:p>
-      <w:pPr>
-        <w:pStyle w:val="BodyText"/>
-      </w:pPr>
-      <w:r>
-        <w:t xml:space="preserve">Al separar analíticamente la</w:t>
-      </w:r>
-      <w:r>
-        <w:t xml:space="preserve"> </w:t>
-      </w:r>
-      <w:r>
-        <w:rPr>
-          <w:b/>
-          <w:bCs/>
-        </w:rPr>
-        <w:t xml:space="preserve">Ignición Física</w:t>
-      </w:r>
-      <w:r>
-        <w:t xml:space="preserve"> </w:t>
-      </w:r>
-      <w:r>
-        <w:t xml:space="preserve">de la</w:t>
-      </w:r>
-      <w:r>
-        <w:t xml:space="preserve"> </w:t>
-      </w:r>
-      <w:r>
-        <w:rPr>
-          <w:b/>
-          <w:bCs/>
-        </w:rPr>
-        <w:t xml:space="preserve">Propagación Táctica</w:t>
-      </w:r>
-      <w:r>
-        <w:t xml:space="preserve">:</w:t>
-      </w:r>
-      <w:r>
-        <w:t xml:space="preserve"> </w:t>
-      </w:r>
-      <w:r>
-        <w:t xml:space="preserve">- Proveemos a los equipos de prevención y patrullaje territorial una herramienta objetiva que señala dónde el bosque está físicamente a punto de arder, antes de que aparezca la primera llama.</w:t>
-      </w:r>
-      <w:r>
-        <w:t xml:space="preserve"> </w:t>
-      </w:r>
-      <w:r>
-        <w:t xml:space="preserve">- Proveemos a los bomberos en el terreno un modelo táctico de combate capaz de anticipar hacia qué cuadrante avanzará el frente activo en las próximas 24 horas con una precisión del</w:t>
-      </w:r>
-      <w:r>
-        <w:t xml:space="preserve"> </w:t>
+        <w:t xml:space="preserve">La literatura reciente de machine learning aplicado al fuego abunda en publicaciones que reportan precisiones aparentemente excepcionales (</w:t>
       </w:r>
       <m:oMath>
-        <m:r>
-          <m:t>97</m:t>
-        </m:r>
         <m:r>
           <m:rPr>
             <m:sty m:val="p"/>
           </m:rPr>
-          <m:t>,</m:t>
-        </m:r>
-        <m:r>
-          <m:t>71</m:t>
+          <m:t>&gt;</m:t>
+        </m:r>
+        <m:r>
+          <m:t>95</m:t>
         </m:r>
         <m:r>
           <m:rPr>
@@ -10592,6 +10780,113 @@
         </m:r>
       </m:oMath>
       <w:r>
+        <w:t xml:space="preserve">) mediante modelos únicos que agrupan variables meteorológicas con la distancia inmediata a focos previos</w:t>
+      </w:r>
+      <w:r>
+        <w:t xml:space="preserve"> </w:t>
+      </w:r>
+      <w:r>
+        <w:t xml:space="preserve">(Coffield et al., 2019; Sayad et al., 2019)</w:t>
+      </w:r>
+      <w:r>
+        <w:t xml:space="preserve">. Tal como advierten las revisiones metodológicas contemporáneas</w:t>
+      </w:r>
+      <w:r>
+        <w:t xml:space="preserve"> </w:t>
+      </w:r>
+      <w:r>
+        <w:t xml:space="preserve">(Jain et al., 2020; Ploton et al., 2020)</w:t>
+      </w:r>
+      <w:r>
+        <w:t xml:space="preserve">, esos modelos sufren de</w:t>
+      </w:r>
+      <w:r>
+        <w:t xml:space="preserve"> </w:t>
+      </w:r>
+      <w:r>
+        <w:rPr>
+          <w:b/>
+          <w:bCs/>
+        </w:rPr>
+        <w:t xml:space="preserve">ceguera selectiva ante la ignición primaria</w:t>
+      </w:r>
+      <w:r>
+        <w:t xml:space="preserve">: cuando se elimina el atajo del fuego anterior, su capacidad predictiva real colapsa.</w:t>
+      </w:r>
+    </w:p>
+    <w:p>
+      <w:pPr>
+        <w:pStyle w:val="BodyText"/>
+      </w:pPr>
+      <w:r>
+        <w:t xml:space="preserve">Al separar analíticamente la</w:t>
+      </w:r>
+      <w:r>
+        <w:t xml:space="preserve"> </w:t>
+      </w:r>
+      <w:r>
+        <w:rPr>
+          <w:b/>
+          <w:bCs/>
+        </w:rPr>
+        <w:t xml:space="preserve">Ignición Física</w:t>
+      </w:r>
+      <w:r>
+        <w:t xml:space="preserve"> </w:t>
+      </w:r>
+      <w:r>
+        <w:t xml:space="preserve">de la</w:t>
+      </w:r>
+      <w:r>
+        <w:t xml:space="preserve"> </w:t>
+      </w:r>
+      <w:r>
+        <w:rPr>
+          <w:b/>
+          <w:bCs/>
+        </w:rPr>
+        <w:t xml:space="preserve">Propagación Táctica</w:t>
+      </w:r>
+      <w:r>
+        <w:t xml:space="preserve">:</w:t>
+      </w:r>
+      <w:r>
+        <w:t xml:space="preserve"> </w:t>
+      </w:r>
+      <w:r>
+        <w:t xml:space="preserve">- Proveemos a los equipos de prevención y patrullaje territorial una herramienta objetiva que señala dónde el bosque está físicamente a punto de arder, antes de que aparezca la primera llama.</w:t>
+      </w:r>
+      <w:r>
+        <w:t xml:space="preserve"> </w:t>
+      </w:r>
+      <w:r>
+        <w:t xml:space="preserve">- Proveemos a los bomberos en el terreno un modelo táctico de combate capaz de anticipar hacia qué cuadrante avanzará el frente activo en las próximas 24 horas con una precisión del</w:t>
+      </w:r>
+      <w:r>
+        <w:t xml:space="preserve"> </w:t>
+      </w:r>
+      <m:oMath>
+        <m:r>
+          <m:t>97</m:t>
+        </m:r>
+        <m:r>
+          <m:rPr>
+            <m:sty m:val="p"/>
+          </m:rPr>
+          <m:t>,</m:t>
+        </m:r>
+        <m:r>
+          <m:t>71</m:t>
+        </m:r>
+        <m:r>
+          <m:rPr>
+            <m:nor/>
+            <m:sty m:val="p"/>
+          </m:rPr>
+          <m:t> %</m:t>
+        </m:r>
+      </m:oMath>
+      <w:r>
         <w:t xml:space="preserve">.</w:t>
       </w:r>
     </w:p>
@@ -10642,6 +10937,12 @@
           <w:bCs/>
         </w:rPr>
         <w:t xml:space="preserve">DuckDB</w:t>
+      </w:r>
+      <w:r>
+        <w:t xml:space="preserve"> </w:t>
+      </w:r>
+      <w:r>
+        <w:t xml:space="preserve">(Raasveldt &amp; Mühleisen, 2019)</w:t>
       </w:r>
       <w:r>
         <w:t xml:space="preserve"> </w:t>
@@ -11048,6 +11349,30 @@
           <w:bCs/>
         </w:rPr>
         <w:t xml:space="preserve">verificación satelital tri-modal multiespectral</w:t>
+      </w:r>
+      <w:r>
+        <w:t xml:space="preserve"> </w:t>
+      </w:r>
+      <w:r>
+        <w:t xml:space="preserve">sustentado en bases de datos de comportamiento global</w:t>
+      </w:r>
+      <w:r>
+        <w:t xml:space="preserve"> </w:t>
+      </w:r>
+      <w:r>
+        <w:t xml:space="preserve">(Artés et al., 2019)</w:t>
+      </w:r>
+      <w:r>
+        <w:t xml:space="preserve"> </w:t>
+      </w:r>
+      <w:r>
+        <w:t xml:space="preserve">y teledetección de cicatrices de quemado</w:t>
+      </w:r>
+      <w:r>
+        <w:t xml:space="preserve"> </w:t>
+      </w:r>
+      <w:r>
+        <w:t xml:space="preserve">(Chuvieco et al., 2019)</w:t>
       </w:r>
       <w:r>
         <w:t xml:space="preserve">:</w:t>
@@ -11729,7 +12054,7 @@
       </w:r>
     </w:p>
     <w:bookmarkEnd w:id="61"/>
-    <w:bookmarkStart w:id="96" w:name="referencias"/>
+    <w:bookmarkStart w:id="145" w:name="referencias"/>
     <w:p>
       <w:pPr>
         <w:pStyle w:val="Heading1"/>
@@ -11738,14 +12063,14 @@
         <w:t xml:space="preserve">Referencias</w:t>
       </w:r>
     </w:p>
-    <w:bookmarkStart w:id="95" w:name="refs"/>
-    <w:bookmarkStart w:id="63" w:name="ref-baumann2017"/>
+    <w:bookmarkStart w:id="144" w:name="refs"/>
+    <w:bookmarkStart w:id="63" w:name="ref-alvarado2018"/>
     <w:p>
       <w:pPr>
         <w:pStyle w:val="Bibliography"/>
       </w:pPr>
       <w:r>
-        <w:t xml:space="preserve">Baumann, M., Gasparri, I., Piquer-Rodrı́guez, M., Ponzoni, G., Volante, J., &amp; Kuemmerle, T. (2017). Carbon emissions from agricultural expansion and intensification in the Chaco.</w:t>
+        <w:t xml:space="preserve">Alvarado, S. T., Silva, C. A., &amp; Archibald, S. (2018). Drivers of fire occurrence in a savanna-forest mosaic in the southern Amazon.</w:t>
       </w:r>
       <w:r>
         <w:t xml:space="preserve"> </w:t>
@@ -11755,7 +12080,7 @@
           <w:i/>
           <w:iCs/>
         </w:rPr>
-        <w:t xml:space="preserve">Global Change Biology</w:t>
+        <w:t xml:space="preserve">Remote Sensing</w:t>
       </w:r>
       <w:r>
         <w:t xml:space="preserve">,</w:t>
@@ -11768,15 +12093,215 @@
           <w:i/>
           <w:iCs/>
         </w:rPr>
+        <w:t xml:space="preserve">10</w:t>
+      </w:r>
+      <w:r>
+        <w:t xml:space="preserve">(9), 1438.</w:t>
+      </w:r>
+      <w:r>
+        <w:t xml:space="preserve"> </w:t>
+      </w:r>
+      <w:hyperlink r:id="rId62">
+        <w:r>
+          <w:rPr>
+            <w:rStyle w:val="Hyperlink"/>
+          </w:rPr>
+          <w:t xml:space="preserve">https://doi.org/10.3390/rs10091438</w:t>
+        </w:r>
+      </w:hyperlink>
+    </w:p>
+    <w:bookmarkEnd w:id="63"/>
+    <w:bookmarkStart w:id="65" w:name="ref-andrews2014"/>
+    <w:p>
+      <w:pPr>
+        <w:pStyle w:val="Bibliography"/>
+      </w:pPr>
+      <w:r>
+        <w:t xml:space="preserve">Andrews, P. L. (2014). Current status and future needs of the</w:t>
+      </w:r>
+      <w:r>
+        <w:t xml:space="preserve"> </w:t>
+      </w:r>
+      <w:r>
+        <w:t xml:space="preserve">BehavePlus</w:t>
+      </w:r>
+      <w:r>
+        <w:t xml:space="preserve"> </w:t>
+      </w:r>
+      <w:r>
+        <w:t xml:space="preserve">fire modeling system.</w:t>
+      </w:r>
+      <w:r>
+        <w:t xml:space="preserve"> </w:t>
+      </w:r>
+      <w:r>
+        <w:rPr>
+          <w:i/>
+          <w:iCs/>
+        </w:rPr>
+        <w:t xml:space="preserve">International Journal of Wildland Fire</w:t>
+      </w:r>
+      <w:r>
+        <w:t xml:space="preserve">,</w:t>
+      </w:r>
+      <w:r>
+        <w:t xml:space="preserve"> </w:t>
+      </w:r>
+      <w:r>
+        <w:rPr>
+          <w:i/>
+          <w:iCs/>
+        </w:rPr>
         <w:t xml:space="preserve">23</w:t>
       </w:r>
       <w:r>
+        <w:t xml:space="preserve">(1), 21-33.</w:t>
+      </w:r>
+      <w:r>
+        <w:t xml:space="preserve"> </w:t>
+      </w:r>
+      <w:hyperlink r:id="rId64">
+        <w:r>
+          <w:rPr>
+            <w:rStyle w:val="Hyperlink"/>
+          </w:rPr>
+          <w:t xml:space="preserve">https://doi.org/10.1071/WF12167</w:t>
+        </w:r>
+      </w:hyperlink>
+    </w:p>
+    <w:bookmarkEnd w:id="65"/>
+    <w:bookmarkStart w:id="67" w:name="ref-artes2019"/>
+    <w:p>
+      <w:pPr>
+        <w:pStyle w:val="Bibliography"/>
+      </w:pPr>
+      <w:r>
+        <w:t xml:space="preserve">Artés, T., Oom, D., Rigo, D. de, Houston Durrant, T., Maianti, P., Libertà, G., &amp; San-Miguel-Ayanz, J. (2019). A global wildfire dataset for the analysis of fire regimes and fire behaviour.</w:t>
+      </w:r>
+      <w:r>
+        <w:t xml:space="preserve"> </w:t>
+      </w:r>
+      <w:r>
+        <w:rPr>
+          <w:i/>
+          <w:iCs/>
+        </w:rPr>
+        <w:t xml:space="preserve">Scientific Data</w:t>
+      </w:r>
+      <w:r>
+        <w:t xml:space="preserve">,</w:t>
+      </w:r>
+      <w:r>
+        <w:t xml:space="preserve"> </w:t>
+      </w:r>
+      <w:r>
+        <w:rPr>
+          <w:i/>
+          <w:iCs/>
+        </w:rPr>
+        <w:t xml:space="preserve">6</w:t>
+      </w:r>
+      <w:r>
+        <w:t xml:space="preserve">(1), 296.</w:t>
+      </w:r>
+      <w:r>
+        <w:t xml:space="preserve"> </w:t>
+      </w:r>
+      <w:hyperlink r:id="rId66">
+        <w:r>
+          <w:rPr>
+            <w:rStyle w:val="Hyperlink"/>
+          </w:rPr>
+          <w:t xml:space="preserve">https://doi.org/10.1038/s41597-019-0312-2</w:t>
+        </w:r>
+      </w:hyperlink>
+    </w:p>
+    <w:bookmarkEnd w:id="67"/>
+    <w:bookmarkStart w:id="69" w:name="ref-barmpoutis2020"/>
+    <w:p>
+      <w:pPr>
+        <w:pStyle w:val="Bibliography"/>
+      </w:pPr>
+      <w:r>
+        <w:t xml:space="preserve">Barmpoutis, P., Papaioannou, P., Dimitropoulos, K., &amp; Grammalidis, N. (2020). A Review on Early Forest Fire Detection Systems Using Optical Remote Sensing.</w:t>
+      </w:r>
+      <w:r>
+        <w:t xml:space="preserve"> </w:t>
+      </w:r>
+      <w:r>
+        <w:rPr>
+          <w:i/>
+          <w:iCs/>
+        </w:rPr>
+        <w:t xml:space="preserve">Sensors</w:t>
+      </w:r>
+      <w:r>
+        <w:t xml:space="preserve">,</w:t>
+      </w:r>
+      <w:r>
+        <w:t xml:space="preserve"> </w:t>
+      </w:r>
+      <w:r>
+        <w:rPr>
+          <w:i/>
+          <w:iCs/>
+        </w:rPr>
+        <w:t xml:space="preserve">20</w:t>
+      </w:r>
+      <w:r>
+        <w:t xml:space="preserve">(22), 6442.</w:t>
+      </w:r>
+      <w:r>
+        <w:t xml:space="preserve"> </w:t>
+      </w:r>
+      <w:hyperlink r:id="rId68">
+        <w:r>
+          <w:rPr>
+            <w:rStyle w:val="Hyperlink"/>
+          </w:rPr>
+          <w:t xml:space="preserve">https://doi.org/10.3390/s20226442</w:t>
+        </w:r>
+      </w:hyperlink>
+    </w:p>
+    <w:bookmarkEnd w:id="69"/>
+    <w:bookmarkStart w:id="71" w:name="ref-baumann2017"/>
+    <w:p>
+      <w:pPr>
+        <w:pStyle w:val="Bibliography"/>
+      </w:pPr>
+      <w:r>
+        <w:t xml:space="preserve">Baumann, M., Gasparri, I., Piquer-Rodrı́guez, M., Ponzoni, G., Volante, J., &amp; Kuemmerle, T. (2017). Carbon emissions from agricultural expansion and intensification in the Chaco.</w:t>
+      </w:r>
+      <w:r>
+        <w:t xml:space="preserve"> </w:t>
+      </w:r>
+      <w:r>
+        <w:rPr>
+          <w:i/>
+          <w:iCs/>
+        </w:rPr>
+        <w:t xml:space="preserve">Global Change Biology</w:t>
+      </w:r>
+      <w:r>
+        <w:t xml:space="preserve">,</w:t>
+      </w:r>
+      <w:r>
+        <w:t xml:space="preserve"> </w:t>
+      </w:r>
+      <w:r>
+        <w:rPr>
+          <w:i/>
+          <w:iCs/>
+        </w:rPr>
+        <w:t xml:space="preserve">23</w:t>
+      </w:r>
+      <w:r>
         <w:t xml:space="preserve">(5), 1902-1916.</w:t>
       </w:r>
       <w:r>
         <w:t xml:space="preserve"> </w:t>
       </w:r>
-      <w:hyperlink r:id="rId62">
+      <w:hyperlink r:id="rId70">
         <w:r>
           <w:rPr>
             <w:rStyle w:val="Hyperlink"/>
@@ -11785,8 +12310,8 @@
         </w:r>
       </w:hyperlink>
     </w:p>
-    <w:bookmarkEnd w:id="63"/>
-    <w:bookmarkStart w:id="65" w:name="ref-chen2016xgboost"/>
+    <w:bookmarkEnd w:id="71"/>
+    <w:bookmarkStart w:id="73" w:name="ref-chen2016xgboost"/>
     <w:p>
       <w:pPr>
         <w:pStyle w:val="Bibliography"/>
@@ -11810,7 +12335,7 @@
       <w:r>
         <w:t xml:space="preserve"> </w:t>
       </w:r>
-      <w:hyperlink r:id="rId64">
+      <w:hyperlink r:id="rId72">
         <w:r>
           <w:rPr>
             <w:rStyle w:val="Hyperlink"/>
@@ -11819,14 +12344,14 @@
         </w:r>
       </w:hyperlink>
     </w:p>
-    <w:bookmarkEnd w:id="65"/>
-    <w:bookmarkStart w:id="67" w:name="ref-jolly2015"/>
+    <w:bookmarkEnd w:id="73"/>
+    <w:bookmarkStart w:id="75" w:name="ref-chuvieco2019"/>
     <w:p>
       <w:pPr>
         <w:pStyle w:val="Bibliography"/>
       </w:pPr>
       <w:r>
-        <w:t xml:space="preserve">Jolly, W. M., Cochrane, M. A., Freeborn, P. H., Holden, Z. A., Brown, T. J., Williamson, G. J., &amp; Bowman, D. M. J. S. (2015). Climate-induced variations in global wildfire danger from 1979 to 2013.</w:t>
+        <w:t xml:space="preserve">Chuvieco, E., Mouillot, F., Werf, G. R. van der, San Miguel, J., Tanase, M., Koutsias, N., Garcı́a, M., Yebra, M., Padilla, M., Gitas, I., Heil, A., Hawbaker, T. J., &amp; Giglio, L. (2019). Historical background and current developments for mapping burned area from satellite Earth observation.</w:t>
       </w:r>
       <w:r>
         <w:t xml:space="preserve"> </w:t>
@@ -11836,7 +12361,7 @@
           <w:i/>
           <w:iCs/>
         </w:rPr>
-        <w:t xml:space="preserve">Nature Communications</w:t>
+        <w:t xml:space="preserve">Remote Sensing of Environment</w:t>
       </w:r>
       <w:r>
         <w:t xml:space="preserve">,</w:t>
@@ -11849,6 +12374,394 @@
           <w:i/>
           <w:iCs/>
         </w:rPr>
+        <w:t xml:space="preserve">225</w:t>
+      </w:r>
+      <w:r>
+        <w:t xml:space="preserve">, 45-64.</w:t>
+      </w:r>
+      <w:r>
+        <w:t xml:space="preserve"> </w:t>
+      </w:r>
+      <w:hyperlink r:id="rId74">
+        <w:r>
+          <w:rPr>
+            <w:rStyle w:val="Hyperlink"/>
+          </w:rPr>
+          <w:t xml:space="preserve">https://doi.org/10.1016/j.rse.2019.02.013</w:t>
+        </w:r>
+      </w:hyperlink>
+    </w:p>
+    <w:bookmarkEnd w:id="75"/>
+    <w:bookmarkStart w:id="77" w:name="ref-coffield2019"/>
+    <w:p>
+      <w:pPr>
+        <w:pStyle w:val="Bibliography"/>
+      </w:pPr>
+      <w:r>
+        <w:t xml:space="preserve">Coffield, S. R., Graff, C. A., Chen, Y., Smyth, P., Foufoula-Georgiou, E., &amp; Randerson, J. T. (2019). Machine learning for predicting wildfire size in the western United States.</w:t>
+      </w:r>
+      <w:r>
+        <w:t xml:space="preserve"> </w:t>
+      </w:r>
+      <w:r>
+        <w:rPr>
+          <w:i/>
+          <w:iCs/>
+        </w:rPr>
+        <w:t xml:space="preserve">Environmental Research Letters</w:t>
+      </w:r>
+      <w:r>
+        <w:t xml:space="preserve">,</w:t>
+      </w:r>
+      <w:r>
+        <w:t xml:space="preserve"> </w:t>
+      </w:r>
+      <w:r>
+        <w:rPr>
+          <w:i/>
+          <w:iCs/>
+        </w:rPr>
+        <w:t xml:space="preserve">14</w:t>
+      </w:r>
+      <w:r>
+        <w:t xml:space="preserve">(3), 034017.</w:t>
+      </w:r>
+      <w:r>
+        <w:t xml:space="preserve"> </w:t>
+      </w:r>
+      <w:hyperlink r:id="rId76">
+        <w:r>
+          <w:rPr>
+            <w:rStyle w:val="Hyperlink"/>
+          </w:rPr>
+          <w:t xml:space="preserve">https://doi.org/10.1088/1748-9326/ab020e</w:t>
+        </w:r>
+      </w:hyperlink>
+    </w:p>
+    <w:bookmarkEnd w:id="77"/>
+    <w:bookmarkStart w:id="79" w:name="ref-dormann2007"/>
+    <w:p>
+      <w:pPr>
+        <w:pStyle w:val="Bibliography"/>
+      </w:pPr>
+      <w:r>
+        <w:t xml:space="preserve">Dormann, C. F., McPherson, J. M., Araújo, M. B., Bivand, R., Bolliger, J., Carl, G., Davies, R. G., Hirzel, A., Jetz, W., Kissling, W. D., Kühn, I., Ohlemüller, R., Peres-Neto, P. R., Reineking, B., Schröder, B., Schurr, F. M., &amp; Wilson, R. (2007). Methods to account for spatial autocorrelation in the analysis of species distributional data: a review.</w:t>
+      </w:r>
+      <w:r>
+        <w:t xml:space="preserve"> </w:t>
+      </w:r>
+      <w:r>
+        <w:rPr>
+          <w:i/>
+          <w:iCs/>
+        </w:rPr>
+        <w:t xml:space="preserve">Ecography</w:t>
+      </w:r>
+      <w:r>
+        <w:t xml:space="preserve">,</w:t>
+      </w:r>
+      <w:r>
+        <w:t xml:space="preserve"> </w:t>
+      </w:r>
+      <w:r>
+        <w:rPr>
+          <w:i/>
+          <w:iCs/>
+        </w:rPr>
+        <w:t xml:space="preserve">30</w:t>
+      </w:r>
+      <w:r>
+        <w:t xml:space="preserve">(5), 609-628.</w:t>
+      </w:r>
+      <w:r>
+        <w:t xml:space="preserve"> </w:t>
+      </w:r>
+      <w:hyperlink r:id="rId78">
+        <w:r>
+          <w:rPr>
+            <w:rStyle w:val="Hyperlink"/>
+          </w:rPr>
+          <w:t xml:space="preserve">https://doi.org/10.1111/j.2007.0906-7590.05171.x</w:t>
+        </w:r>
+      </w:hyperlink>
+    </w:p>
+    <w:bookmarkEnd w:id="79"/>
+    <w:bookmarkStart w:id="81" w:name="ref-flannigan2009"/>
+    <w:p>
+      <w:pPr>
+        <w:pStyle w:val="Bibliography"/>
+      </w:pPr>
+      <w:r>
+        <w:t xml:space="preserve">Flannigan, M. D., Krawchuk, M. A., Groot, W. J. de, Wotton, B. M., &amp; Gowman, L. M. (2009). Implications of changing climate for global wildland fire.</w:t>
+      </w:r>
+      <w:r>
+        <w:t xml:space="preserve"> </w:t>
+      </w:r>
+      <w:r>
+        <w:rPr>
+          <w:i/>
+          <w:iCs/>
+        </w:rPr>
+        <w:t xml:space="preserve">International Journal of Wildland Fire</w:t>
+      </w:r>
+      <w:r>
+        <w:t xml:space="preserve">,</w:t>
+      </w:r>
+      <w:r>
+        <w:t xml:space="preserve"> </w:t>
+      </w:r>
+      <w:r>
+        <w:rPr>
+          <w:i/>
+          <w:iCs/>
+        </w:rPr>
+        <w:t xml:space="preserve">18</w:t>
+      </w:r>
+      <w:r>
+        <w:t xml:space="preserve">(5), 483-507.</w:t>
+      </w:r>
+      <w:r>
+        <w:t xml:space="preserve"> </w:t>
+      </w:r>
+      <w:hyperlink r:id="rId80">
+        <w:r>
+          <w:rPr>
+            <w:rStyle w:val="Hyperlink"/>
+          </w:rPr>
+          <w:t xml:space="preserve">https://doi.org/10.1071/WF08187</w:t>
+        </w:r>
+      </w:hyperlink>
+    </w:p>
+    <w:bookmarkEnd w:id="81"/>
+    <w:bookmarkStart w:id="83" w:name="ref-flannigan2016"/>
+    <w:p>
+      <w:pPr>
+        <w:pStyle w:val="Bibliography"/>
+      </w:pPr>
+      <w:r>
+        <w:t xml:space="preserve">Flannigan, M. D., Wotton, B. M., Marshall, G. A., Groot, W. J. de, Johnston, J., Jurko, N., &amp; Cantin, A. S. (2016). Fuel moisture sensitivity to temperature and precipitation: climate change implications.</w:t>
+      </w:r>
+      <w:r>
+        <w:t xml:space="preserve"> </w:t>
+      </w:r>
+      <w:r>
+        <w:rPr>
+          <w:i/>
+          <w:iCs/>
+        </w:rPr>
+        <w:t xml:space="preserve">Climatic Change</w:t>
+      </w:r>
+      <w:r>
+        <w:t xml:space="preserve">,</w:t>
+      </w:r>
+      <w:r>
+        <w:t xml:space="preserve"> </w:t>
+      </w:r>
+      <w:r>
+        <w:rPr>
+          <w:i/>
+          <w:iCs/>
+        </w:rPr>
+        <w:t xml:space="preserve">134</w:t>
+      </w:r>
+      <w:r>
+        <w:t xml:space="preserve">(1), 59-71.</w:t>
+      </w:r>
+      <w:r>
+        <w:t xml:space="preserve"> </w:t>
+      </w:r>
+      <w:hyperlink r:id="rId82">
+        <w:r>
+          <w:rPr>
+            <w:rStyle w:val="Hyperlink"/>
+          </w:rPr>
+          <w:t xml:space="preserve">https://doi.org/10.1007/s10584-015-1521-0</w:t>
+        </w:r>
+      </w:hyperlink>
+    </w:p>
+    <w:bookmarkEnd w:id="83"/>
+    <w:bookmarkStart w:id="85" w:name="ref-giglio2016"/>
+    <w:p>
+      <w:pPr>
+        <w:pStyle w:val="Bibliography"/>
+      </w:pPr>
+      <w:r>
+        <w:t xml:space="preserve">Giglio, L., Schroeder, W., &amp; Justice, C. O. (2016). The collection 6</w:t>
+      </w:r>
+      <w:r>
+        <w:t xml:space="preserve"> </w:t>
+      </w:r>
+      <w:r>
+        <w:t xml:space="preserve">MODIS</w:t>
+      </w:r>
+      <w:r>
+        <w:t xml:space="preserve"> </w:t>
+      </w:r>
+      <w:r>
+        <w:t xml:space="preserve">active fire detection algorithm and fire products.</w:t>
+      </w:r>
+      <w:r>
+        <w:t xml:space="preserve"> </w:t>
+      </w:r>
+      <w:r>
+        <w:rPr>
+          <w:i/>
+          <w:iCs/>
+        </w:rPr>
+        <w:t xml:space="preserve">Remote Sensing of Environment</w:t>
+      </w:r>
+      <w:r>
+        <w:t xml:space="preserve">,</w:t>
+      </w:r>
+      <w:r>
+        <w:t xml:space="preserve"> </w:t>
+      </w:r>
+      <w:r>
+        <w:rPr>
+          <w:i/>
+          <w:iCs/>
+        </w:rPr>
+        <w:t xml:space="preserve">178</w:t>
+      </w:r>
+      <w:r>
+        <w:t xml:space="preserve">, 31-41.</w:t>
+      </w:r>
+      <w:r>
+        <w:t xml:space="preserve"> </w:t>
+      </w:r>
+      <w:hyperlink r:id="rId84">
+        <w:r>
+          <w:rPr>
+            <w:rStyle w:val="Hyperlink"/>
+          </w:rPr>
+          <w:t xml:space="preserve">https://doi.org/10.1016/j.rse.2016.02.054</w:t>
+        </w:r>
+      </w:hyperlink>
+    </w:p>
+    <w:bookmarkEnd w:id="85"/>
+    <w:bookmarkStart w:id="87" w:name="ref-gorelick2017"/>
+    <w:p>
+      <w:pPr>
+        <w:pStyle w:val="Bibliography"/>
+      </w:pPr>
+      <w:r>
+        <w:t xml:space="preserve">Gorelick, N., Hancher, M., Dixon, M., Ilyushchenko, S., Thau, D., &amp; Moore, R. (2017). Google Earth Engine: Planetary-scale geospatial analysis for everyone.</w:t>
+      </w:r>
+      <w:r>
+        <w:t xml:space="preserve"> </w:t>
+      </w:r>
+      <w:r>
+        <w:rPr>
+          <w:i/>
+          <w:iCs/>
+        </w:rPr>
+        <w:t xml:space="preserve">Remote Sensing of Environment</w:t>
+      </w:r>
+      <w:r>
+        <w:t xml:space="preserve">,</w:t>
+      </w:r>
+      <w:r>
+        <w:t xml:space="preserve"> </w:t>
+      </w:r>
+      <w:r>
+        <w:rPr>
+          <w:i/>
+          <w:iCs/>
+        </w:rPr>
+        <w:t xml:space="preserve">202</w:t>
+      </w:r>
+      <w:r>
+        <w:t xml:space="preserve">, 18-27.</w:t>
+      </w:r>
+      <w:r>
+        <w:t xml:space="preserve"> </w:t>
+      </w:r>
+      <w:hyperlink r:id="rId86">
+        <w:r>
+          <w:rPr>
+            <w:rStyle w:val="Hyperlink"/>
+          </w:rPr>
+          <w:t xml:space="preserve">https://doi.org/10.1016/j.rse.2017.06.031</w:t>
+        </w:r>
+      </w:hyperlink>
+    </w:p>
+    <w:bookmarkEnd w:id="87"/>
+    <w:bookmarkStart w:id="89" w:name="ref-jain2020review"/>
+    <w:p>
+      <w:pPr>
+        <w:pStyle w:val="Bibliography"/>
+      </w:pPr>
+      <w:r>
+        <w:t xml:space="preserve">Jain, P., Coogan, S. C. P., Subramanian, S. G., Crowley, M., Taylor, S., &amp; Flannigan, M. D. (2020). A review of machine learning applications in wildland fire science and management.</w:t>
+      </w:r>
+      <w:r>
+        <w:t xml:space="preserve"> </w:t>
+      </w:r>
+      <w:r>
+        <w:rPr>
+          <w:i/>
+          <w:iCs/>
+        </w:rPr>
+        <w:t xml:space="preserve">Environmental Reviews</w:t>
+      </w:r>
+      <w:r>
+        <w:t xml:space="preserve">,</w:t>
+      </w:r>
+      <w:r>
+        <w:t xml:space="preserve"> </w:t>
+      </w:r>
+      <w:r>
+        <w:rPr>
+          <w:i/>
+          <w:iCs/>
+        </w:rPr>
+        <w:t xml:space="preserve">28</w:t>
+      </w:r>
+      <w:r>
+        <w:t xml:space="preserve">(4), 478-505.</w:t>
+      </w:r>
+      <w:r>
+        <w:t xml:space="preserve"> </w:t>
+      </w:r>
+      <w:hyperlink r:id="rId88">
+        <w:r>
+          <w:rPr>
+            <w:rStyle w:val="Hyperlink"/>
+          </w:rPr>
+          <w:t xml:space="preserve">https://doi.org/10.1139/er-2020-0019</w:t>
+        </w:r>
+      </w:hyperlink>
+    </w:p>
+    <w:bookmarkEnd w:id="89"/>
+    <w:bookmarkStart w:id="91" w:name="ref-jolly2015"/>
+    <w:p>
+      <w:pPr>
+        <w:pStyle w:val="Bibliography"/>
+      </w:pPr>
+      <w:r>
+        <w:t xml:space="preserve">Jolly, W. M., Cochrane, M. A., Freeborn, P. H., Holden, Z. A., Brown, T. J., Williamson, G. J., &amp; Bowman, D. M. J. S. (2015). Climate-induced variations in global wildfire danger from 1979 to 2013.</w:t>
+      </w:r>
+      <w:r>
+        <w:t xml:space="preserve"> </w:t>
+      </w:r>
+      <w:r>
+        <w:rPr>
+          <w:i/>
+          <w:iCs/>
+        </w:rPr>
+        <w:t xml:space="preserve">Nature Communications</w:t>
+      </w:r>
+      <w:r>
+        <w:t xml:space="preserve">,</w:t>
+      </w:r>
+      <w:r>
+        <w:t xml:space="preserve"> </w:t>
+      </w:r>
+      <w:r>
+        <w:rPr>
+          <w:i/>
+          <w:iCs/>
+        </w:rPr>
         <w:t xml:space="preserve">6</w:t>
       </w:r>
       <w:r>
@@ -11857,7 +12770,7 @@
       <w:r>
         <w:t xml:space="preserve"> </w:t>
       </w:r>
-      <w:hyperlink r:id="rId66">
+      <w:hyperlink r:id="rId90">
         <w:r>
           <w:rPr>
             <w:rStyle w:val="Hyperlink"/>
@@ -11866,14 +12779,26 @@
         </w:r>
       </w:hyperlink>
     </w:p>
-    <w:bookmarkEnd w:id="67"/>
-    <w:bookmarkStart w:id="68" w:name="ref-ke2017lightgbm"/>
+    <w:bookmarkEnd w:id="91"/>
+    <w:bookmarkStart w:id="93" w:name="ref-justice2002"/>
     <w:p>
       <w:pPr>
         <w:pStyle w:val="Bibliography"/>
       </w:pPr>
       <w:r>
-        <w:t xml:space="preserve">Ke, G., Meng, Q., Finley, T., Wang, T., Chen, W., Ma, W., Ye, Q., &amp; Liu, T.-Y. (2017). LightGBM: A Highly Efficient Gradient Boosting Decision Tree.</w:t>
+        <w:t xml:space="preserve">Justice, C. O., Giglio, L., Korontzi, S., Owens, J., Morisette, J. T., Roy, D. P., Descloitres, J., Alleaume, S., Petitcolin, F., &amp; Kaufman, Y. J. (2002). The</w:t>
+      </w:r>
+      <w:r>
+        <w:t xml:space="preserve"> </w:t>
+      </w:r>
+      <w:r>
+        <w:t xml:space="preserve">MODIS</w:t>
+      </w:r>
+      <w:r>
+        <w:t xml:space="preserve"> </w:t>
+      </w:r>
+      <w:r>
+        <w:t xml:space="preserve">fire products.</w:t>
       </w:r>
       <w:r>
         <w:t xml:space="preserve"> </w:t>
@@ -11883,7 +12808,7 @@
           <w:i/>
           <w:iCs/>
         </w:rPr>
-        <w:t xml:space="preserve">Advances in Neural Information Processing Systems (NeurIPS)</w:t>
+        <w:t xml:space="preserve">Remote Sensing of Environment</w:t>
       </w:r>
       <w:r>
         <w:t xml:space="preserve">,</w:t>
@@ -11896,32 +12821,31 @@
           <w:i/>
           <w:iCs/>
         </w:rPr>
-        <w:t xml:space="preserve">30</w:t>
-      </w:r>
-      <w:r>
-        <w:t xml:space="preserve">, 3146-3154.</w:t>
-      </w:r>
-    </w:p>
-    <w:bookmarkEnd w:id="68"/>
-    <w:bookmarkStart w:id="70" w:name="ref-lundberg2020treeshap"/>
+        <w:t xml:space="preserve">83</w:t>
+      </w:r>
+      <w:r>
+        <w:t xml:space="preserve">(1–2), 244-262.</w:t>
+      </w:r>
+      <w:r>
+        <w:t xml:space="preserve"> </w:t>
+      </w:r>
+      <w:hyperlink r:id="rId92">
+        <w:r>
+          <w:rPr>
+            <w:rStyle w:val="Hyperlink"/>
+          </w:rPr>
+          <w:t xml:space="preserve">https://doi.org/10.1016/S0034-4257(02)00076-7</w:t>
+        </w:r>
+      </w:hyperlink>
+    </w:p>
+    <w:bookmarkEnd w:id="93"/>
+    <w:bookmarkStart w:id="94" w:name="ref-ke2017lightgbm"/>
     <w:p>
       <w:pPr>
         <w:pStyle w:val="Bibliography"/>
       </w:pPr>
       <w:r>
-        <w:t xml:space="preserve">Lundberg, S. M., Erion, G., Chen, H., DeGrave, A., Prutkin, J. M., Nair, B., Katz, R., Himmelfarb, J., Bansal, N., &amp; Lee, S.-I. (2020). From local explanations to global understanding with explainable</w:t>
-      </w:r>
-      <w:r>
-        <w:t xml:space="preserve"> </w:t>
-      </w:r>
-      <w:r>
-        <w:t xml:space="preserve">AI</w:t>
-      </w:r>
-      <w:r>
-        <w:t xml:space="preserve"> </w:t>
-      </w:r>
-      <w:r>
-        <w:t xml:space="preserve">for trees.</w:t>
+        <w:t xml:space="preserve">Ke, G., Meng, Q., Finley, T., Wang, T., Chen, W., Ma, W., Ye, Q., &amp; Liu, T.-Y. (2017). LightGBM: A Highly Efficient Gradient Boosting Decision Tree.</w:t>
       </w:r>
       <w:r>
         <w:t xml:space="preserve"> </w:t>
@@ -11931,7 +12855,7 @@
           <w:i/>
           <w:iCs/>
         </w:rPr>
-        <w:t xml:space="preserve">Nature Machine Intelligence</w:t>
+        <w:t xml:space="preserve">Advances in Neural Information Processing Systems (NeurIPS)</w:t>
       </w:r>
       <w:r>
         <w:t xml:space="preserve">,</w:t>
@@ -11944,6 +12868,101 @@
           <w:i/>
           <w:iCs/>
         </w:rPr>
+        <w:t xml:space="preserve">30</w:t>
+      </w:r>
+      <w:r>
+        <w:t xml:space="preserve">, 3146-3154.</w:t>
+      </w:r>
+    </w:p>
+    <w:bookmarkEnd w:id="94"/>
+    <w:bookmarkStart w:id="96" w:name="ref-legendre1993"/>
+    <w:p>
+      <w:pPr>
+        <w:pStyle w:val="Bibliography"/>
+      </w:pPr>
+      <w:r>
+        <w:t xml:space="preserve">Legendre, P. (1993). Spatial autocorrelation: trouble or new paradigm?</w:t>
+      </w:r>
+      <w:r>
+        <w:t xml:space="preserve"> </w:t>
+      </w:r>
+      <w:r>
+        <w:rPr>
+          <w:i/>
+          <w:iCs/>
+        </w:rPr>
+        <w:t xml:space="preserve">Ecology</w:t>
+      </w:r>
+      <w:r>
+        <w:t xml:space="preserve">,</w:t>
+      </w:r>
+      <w:r>
+        <w:t xml:space="preserve"> </w:t>
+      </w:r>
+      <w:r>
+        <w:rPr>
+          <w:i/>
+          <w:iCs/>
+        </w:rPr>
+        <w:t xml:space="preserve">74</w:t>
+      </w:r>
+      <w:r>
+        <w:t xml:space="preserve">(6), 1659-1673.</w:t>
+      </w:r>
+      <w:r>
+        <w:t xml:space="preserve"> </w:t>
+      </w:r>
+      <w:hyperlink r:id="rId95">
+        <w:r>
+          <w:rPr>
+            <w:rStyle w:val="Hyperlink"/>
+          </w:rPr>
+          <w:t xml:space="preserve">https://doi.org/10.2307/1939924</w:t>
+        </w:r>
+      </w:hyperlink>
+    </w:p>
+    <w:bookmarkEnd w:id="96"/>
+    <w:bookmarkStart w:id="98" w:name="ref-lundberg2020treeshap"/>
+    <w:p>
+      <w:pPr>
+        <w:pStyle w:val="Bibliography"/>
+      </w:pPr>
+      <w:r>
+        <w:t xml:space="preserve">Lundberg, S. M., Erion, G., Chen, H., DeGrave, A., Prutkin, J. M., Nair, B., Katz, R., Himmelfarb, J., Bansal, N., &amp; Lee, S.-I. (2020). From local explanations to global understanding with explainable</w:t>
+      </w:r>
+      <w:r>
+        <w:t xml:space="preserve"> </w:t>
+      </w:r>
+      <w:r>
+        <w:t xml:space="preserve">AI</w:t>
+      </w:r>
+      <w:r>
+        <w:t xml:space="preserve"> </w:t>
+      </w:r>
+      <w:r>
+        <w:t xml:space="preserve">for trees.</w:t>
+      </w:r>
+      <w:r>
+        <w:t xml:space="preserve"> </w:t>
+      </w:r>
+      <w:r>
+        <w:rPr>
+          <w:i/>
+          <w:iCs/>
+        </w:rPr>
+        <w:t xml:space="preserve">Nature Machine Intelligence</w:t>
+      </w:r>
+      <w:r>
+        <w:t xml:space="preserve">,</w:t>
+      </w:r>
+      <w:r>
+        <w:t xml:space="preserve"> </w:t>
+      </w:r>
+      <w:r>
+        <w:rPr>
+          <w:i/>
+          <w:iCs/>
+        </w:rPr>
         <w:t xml:space="preserve">2</w:t>
       </w:r>
       <w:r>
@@ -11952,7 +12971,7 @@
       <w:r>
         <w:t xml:space="preserve"> </w:t>
       </w:r>
-      <w:hyperlink r:id="rId69">
+      <w:hyperlink r:id="rId97">
         <w:r>
           <w:rPr>
             <w:rStyle w:val="Hyperlink"/>
@@ -11961,8 +12980,8 @@
         </w:r>
       </w:hyperlink>
     </w:p>
-    <w:bookmarkEnd w:id="70"/>
-    <w:bookmarkStart w:id="72" w:name="ref-mapbiomas2023"/>
+    <w:bookmarkEnd w:id="98"/>
+    <w:bookmarkStart w:id="100" w:name="ref-mapbiomas2023"/>
     <w:p>
       <w:pPr>
         <w:pStyle w:val="Bibliography"/>
@@ -12000,7 +13019,7 @@
       <w:r>
         <w:t xml:space="preserve"> </w:t>
       </w:r>
-      <w:hyperlink r:id="rId71">
+      <w:hyperlink r:id="rId99">
         <w:r>
           <w:rPr>
             <w:rStyle w:val="Hyperlink"/>
@@ -12012,23 +13031,14 @@
         <w:t xml:space="preserve">.</w:t>
       </w:r>
     </w:p>
-    <w:bookmarkEnd w:id="72"/>
-    <w:bookmarkStart w:id="74" w:name="ref-munoz2021era5land"/>
+    <w:bookmarkEnd w:id="100"/>
+    <w:bookmarkStart w:id="102" w:name="ref-meyer2021"/>
     <w:p>
       <w:pPr>
         <w:pStyle w:val="Bibliography"/>
       </w:pPr>
       <w:r>
-        <w:t xml:space="preserve">Muñoz-Sabater, J., Dutra, E., Agustı́-Panareda, A., Albergel, C., Arduini, G., Balsamo, G., Boussetta, S., Choulga, M., Harrigan, S., Hersbach, H., Martens, B., Miralles, D. G., Piles, M., Rodrı́guez-Fernández, N. J., Zsoter, E., Buontempo, C., &amp; Thépaut, J.-N. (2021).</w:t>
-      </w:r>
-      <w:r>
-        <w:t xml:space="preserve"> </w:t>
-      </w:r>
-      <w:r>
-        <w:t xml:space="preserve">ERA5-Land</w:t>
-      </w:r>
-      <w:r>
-        <w:t xml:space="preserve">: a state-of-the-art global reanalysis dataset for land applications.</w:t>
+        <w:t xml:space="preserve">Meyer, H., &amp; Pebesma, E. (2021). Predicting into unknown space? Estimating the area of applicability of spatial prediction models.</w:t>
       </w:r>
       <w:r>
         <w:t xml:space="preserve"> </w:t>
@@ -12038,7 +13048,7 @@
           <w:i/>
           <w:iCs/>
         </w:rPr>
-        <w:t xml:space="preserve">Earth System Science Data</w:t>
+        <w:t xml:space="preserve">Methods in Ecology and Evolution</w:t>
       </w:r>
       <w:r>
         <w:t xml:space="preserve">,</w:t>
@@ -12051,6 +13061,62 @@
           <w:i/>
           <w:iCs/>
         </w:rPr>
+        <w:t xml:space="preserve">12</w:t>
+      </w:r>
+      <w:r>
+        <w:t xml:space="preserve">(9), 1620-1633.</w:t>
+      </w:r>
+      <w:r>
+        <w:t xml:space="preserve"> </w:t>
+      </w:r>
+      <w:hyperlink r:id="rId101">
+        <w:r>
+          <w:rPr>
+            <w:rStyle w:val="Hyperlink"/>
+          </w:rPr>
+          <w:t xml:space="preserve">https://doi.org/10.1111/2041-210X.13650</w:t>
+        </w:r>
+      </w:hyperlink>
+    </w:p>
+    <w:bookmarkEnd w:id="102"/>
+    <w:bookmarkStart w:id="104" w:name="ref-munoz2021era5land"/>
+    <w:p>
+      <w:pPr>
+        <w:pStyle w:val="Bibliography"/>
+      </w:pPr>
+      <w:r>
+        <w:t xml:space="preserve">Muñoz-Sabater, J., Dutra, E., Agustı́-Panareda, A., Albergel, C., Arduini, G., Balsamo, G., Boussetta, S., Choulga, M., Harrigan, S., Hersbach, H., Martens, B., Miralles, D. G., Piles, M., Rodrı́guez-Fernández, N. J., Zsoter, E., Buontempo, C., &amp; Thépaut, J.-N. (2021).</w:t>
+      </w:r>
+      <w:r>
+        <w:t xml:space="preserve"> </w:t>
+      </w:r>
+      <w:r>
+        <w:t xml:space="preserve">ERA5-Land</w:t>
+      </w:r>
+      <w:r>
+        <w:t xml:space="preserve">: a state-of-the-art global reanalysis dataset for land applications.</w:t>
+      </w:r>
+      <w:r>
+        <w:t xml:space="preserve"> </w:t>
+      </w:r>
+      <w:r>
+        <w:rPr>
+          <w:i/>
+          <w:iCs/>
+        </w:rPr>
+        <w:t xml:space="preserve">Earth System Science Data</w:t>
+      </w:r>
+      <w:r>
+        <w:t xml:space="preserve">,</w:t>
+      </w:r>
+      <w:r>
+        <w:t xml:space="preserve"> </w:t>
+      </w:r>
+      <w:r>
+        <w:rPr>
+          <w:i/>
+          <w:iCs/>
+        </w:rPr>
         <w:t xml:space="preserve">13</w:t>
       </w:r>
       <w:r>
@@ -12059,7 +13125,7 @@
       <w:r>
         <w:t xml:space="preserve"> </w:t>
       </w:r>
-      <w:hyperlink r:id="rId73">
+      <w:hyperlink r:id="rId103">
         <w:r>
           <w:rPr>
             <w:rStyle w:val="Hyperlink"/>
@@ -12068,8 +13134,8 @@
         </w:r>
       </w:hyperlink>
     </w:p>
-    <w:bookmarkEnd w:id="74"/>
-    <w:bookmarkStart w:id="76" w:name="ref-niculescu2005"/>
+    <w:bookmarkEnd w:id="104"/>
+    <w:bookmarkStart w:id="106" w:name="ref-niculescu2005"/>
     <w:p>
       <w:pPr>
         <w:pStyle w:val="Bibliography"/>
@@ -12093,7 +13159,7 @@
       <w:r>
         <w:t xml:space="preserve"> </w:t>
       </w:r>
-      <w:hyperlink r:id="rId75">
+      <w:hyperlink r:id="rId105">
         <w:r>
           <w:rPr>
             <w:rStyle w:val="Hyperlink"/>
@@ -12102,14 +13168,23 @@
         </w:r>
       </w:hyperlink>
     </w:p>
-    <w:bookmarkEnd w:id="76"/>
-    <w:bookmarkStart w:id="77" w:name="ref-platt1999"/>
+    <w:bookmarkEnd w:id="106"/>
+    <w:bookmarkStart w:id="107" w:name="ref-pedregosa2011"/>
     <w:p>
       <w:pPr>
         <w:pStyle w:val="Bibliography"/>
       </w:pPr>
       <w:r>
-        <w:t xml:space="preserve">Platt, J. (1999). Probabilistic outputs for support vector machines and comparisons to regularized likelihood methods.</w:t>
+        <w:t xml:space="preserve">Pedregosa, F., Varoquaux, G., Gramfort, A., Michel, V., Thirion, B., Grisel, O., Blondel, M., Prettenhofer, P., Weiss, R., Dubourg, V., Vanderplas, J., Passos, A., Cournapeau, D., Brucher, M., Perrot, M., &amp; Duchesnay, É. (2011). Scikit-learn: Machine Learning in</w:t>
+      </w:r>
+      <w:r>
+        <w:t xml:space="preserve"> </w:t>
+      </w:r>
+      <w:r>
+        <w:t xml:space="preserve">Python</w:t>
+      </w:r>
+      <w:r>
+        <w:t xml:space="preserve">.</w:t>
       </w:r>
       <w:r>
         <w:t xml:space="preserve"> </w:t>
@@ -12119,20 +13194,10 @@
           <w:i/>
           <w:iCs/>
         </w:rPr>
-        <w:t xml:space="preserve">Advances in Large Margin Classifiers</w:t>
-      </w:r>
-      <w:r>
-        <w:t xml:space="preserve">, 61-74.</w:t>
-      </w:r>
-    </w:p>
-    <w:bookmarkEnd w:id="77"/>
-    <w:bookmarkStart w:id="79" w:name="ref-ploton2020"/>
-    <w:p>
-      <w:pPr>
-        <w:pStyle w:val="Bibliography"/>
-      </w:pPr>
-      <w:r>
-        <w:t xml:space="preserve">Ploton, P., Mortier, F., Réjou-Méchain, M., Barbier, N., Picard, N., Rossi, V., Dormann, C. F., Cornu, G., Viennois, G., Bayol, N., &amp; Pelissier, R. (2020). Spatial validation reveals poor predictive performance of large-scale ecological mapping models.</w:t>
+        <w:t xml:space="preserve">Journal of Machine Learning Research</w:t>
+      </w:r>
+      <w:r>
+        <w:t xml:space="preserve">,</w:t>
       </w:r>
       <w:r>
         <w:t xml:space="preserve"> </w:t>
@@ -12142,10 +13207,20 @@
           <w:i/>
           <w:iCs/>
         </w:rPr>
-        <w:t xml:space="preserve">Nature Communications</w:t>
-      </w:r>
-      <w:r>
-        <w:t xml:space="preserve">,</w:t>
+        <w:t xml:space="preserve">12</w:t>
+      </w:r>
+      <w:r>
+        <w:t xml:space="preserve">, 2825-2830.</w:t>
+      </w:r>
+    </w:p>
+    <w:bookmarkEnd w:id="107"/>
+    <w:bookmarkStart w:id="109" w:name="ref-pivello2021"/>
+    <w:p>
+      <w:pPr>
+        <w:pStyle w:val="Bibliography"/>
+      </w:pPr>
+      <w:r>
+        <w:t xml:space="preserve">Pivello, V. R., Vieira, I., Christianini, A. V., Ribeiro, D. B., Silva Menezes, L. da, Berlinck, C. N., Melo, F. P. L., Marengo, J. A., Tornquist, C. G., Tomas, W. M., &amp; Overbeck, G. E. (2021). Understanding Brazil’s catastrophic fires: Causes, consequences and policy needed.</w:t>
       </w:r>
       <w:r>
         <w:t xml:space="preserve"> </w:t>
@@ -12155,6 +13230,89 @@
           <w:i/>
           <w:iCs/>
         </w:rPr>
+        <w:t xml:space="preserve">Perspectives in Ecology and Conservation</w:t>
+      </w:r>
+      <w:r>
+        <w:t xml:space="preserve">,</w:t>
+      </w:r>
+      <w:r>
+        <w:t xml:space="preserve"> </w:t>
+      </w:r>
+      <w:r>
+        <w:rPr>
+          <w:i/>
+          <w:iCs/>
+        </w:rPr>
+        <w:t xml:space="preserve">19</w:t>
+      </w:r>
+      <w:r>
+        <w:t xml:space="preserve">(3), 233-255.</w:t>
+      </w:r>
+      <w:r>
+        <w:t xml:space="preserve"> </w:t>
+      </w:r>
+      <w:hyperlink r:id="rId108">
+        <w:r>
+          <w:rPr>
+            <w:rStyle w:val="Hyperlink"/>
+          </w:rPr>
+          <w:t xml:space="preserve">https://doi.org/10.1016/j.pecon.2021.06.005</w:t>
+        </w:r>
+      </w:hyperlink>
+    </w:p>
+    <w:bookmarkEnd w:id="109"/>
+    <w:bookmarkStart w:id="110" w:name="ref-platt1999"/>
+    <w:p>
+      <w:pPr>
+        <w:pStyle w:val="Bibliography"/>
+      </w:pPr>
+      <w:r>
+        <w:t xml:space="preserve">Platt, J. (1999). Probabilistic outputs for support vector machines and comparisons to regularized likelihood methods.</w:t>
+      </w:r>
+      <w:r>
+        <w:t xml:space="preserve"> </w:t>
+      </w:r>
+      <w:r>
+        <w:rPr>
+          <w:i/>
+          <w:iCs/>
+        </w:rPr>
+        <w:t xml:space="preserve">Advances in Large Margin Classifiers</w:t>
+      </w:r>
+      <w:r>
+        <w:t xml:space="preserve">, 61-74.</w:t>
+      </w:r>
+    </w:p>
+    <w:bookmarkEnd w:id="110"/>
+    <w:bookmarkStart w:id="112" w:name="ref-ploton2020"/>
+    <w:p>
+      <w:pPr>
+        <w:pStyle w:val="Bibliography"/>
+      </w:pPr>
+      <w:r>
+        <w:t xml:space="preserve">Ploton, P., Mortier, F., Réjou-Méchain, M., Barbier, N., Picard, N., Rossi, V., Dormann, C. F., Cornu, G., Viennois, G., Bayol, N., &amp; Pelissier, R. (2020). Spatial validation reveals poor predictive performance of large-scale ecological mapping models.</w:t>
+      </w:r>
+      <w:r>
+        <w:t xml:space="preserve"> </w:t>
+      </w:r>
+      <w:r>
+        <w:rPr>
+          <w:i/>
+          <w:iCs/>
+        </w:rPr>
+        <w:t xml:space="preserve">Nature Communications</w:t>
+      </w:r>
+      <w:r>
+        <w:t xml:space="preserve">,</w:t>
+      </w:r>
+      <w:r>
+        <w:t xml:space="preserve"> </w:t>
+      </w:r>
+      <w:r>
+        <w:rPr>
+          <w:i/>
+          <w:iCs/>
+        </w:rPr>
         <w:t xml:space="preserve">11</w:t>
       </w:r>
       <w:r>
@@ -12163,7 +13321,7 @@
       <w:r>
         <w:t xml:space="preserve"> </w:t>
       </w:r>
-      <w:hyperlink r:id="rId78">
+      <w:hyperlink r:id="rId111">
         <w:r>
           <w:rPr>
             <w:rStyle w:val="Hyperlink"/>
@@ -12172,14 +13330,14 @@
         </w:r>
       </w:hyperlink>
     </w:p>
-    <w:bookmarkEnd w:id="79"/>
-    <w:bookmarkStart w:id="81" w:name="ref-raasveldt2019duckdb"/>
+    <w:bookmarkEnd w:id="112"/>
+    <w:bookmarkStart w:id="113" w:name="ref-prokhorenkova2018"/>
     <w:p>
       <w:pPr>
         <w:pStyle w:val="Bibliography"/>
       </w:pPr>
       <w:r>
-        <w:t xml:space="preserve">Raasveldt, M., &amp; Mühleisen, H. (2019). DuckDB: an Embeddable Analytical Database.</w:t>
+        <w:t xml:space="preserve">Prokhorenkova, L., Gusev, G., Vorobev, A., Dorogush, A. V., &amp; Gulin, A. (2018). CatBoost: unbiased boosting with categorical features.</w:t>
       </w:r>
       <w:r>
         <w:t xml:space="preserve"> </w:t>
@@ -12189,6 +13347,42 @@
           <w:i/>
           <w:iCs/>
         </w:rPr>
+        <w:t xml:space="preserve">Advances in Neural Information Processing Systems (NeurIPS)</w:t>
+      </w:r>
+      <w:r>
+        <w:t xml:space="preserve">,</w:t>
+      </w:r>
+      <w:r>
+        <w:t xml:space="preserve"> </w:t>
+      </w:r>
+      <w:r>
+        <w:rPr>
+          <w:i/>
+          <w:iCs/>
+        </w:rPr>
+        <w:t xml:space="preserve">31</w:t>
+      </w:r>
+      <w:r>
+        <w:t xml:space="preserve">, 6638-6648.</w:t>
+      </w:r>
+    </w:p>
+    <w:bookmarkEnd w:id="113"/>
+    <w:bookmarkStart w:id="115" w:name="ref-raasveldt2019duckdb"/>
+    <w:p>
+      <w:pPr>
+        <w:pStyle w:val="Bibliography"/>
+      </w:pPr>
+      <w:r>
+        <w:t xml:space="preserve">Raasveldt, M., &amp; Mühleisen, H. (2019). DuckDB: an Embeddable Analytical Database.</w:t>
+      </w:r>
+      <w:r>
+        <w:t xml:space="preserve"> </w:t>
+      </w:r>
+      <w:r>
+        <w:rPr>
+          <w:i/>
+          <w:iCs/>
+        </w:rPr>
         <w:t xml:space="preserve">Proceedings of the 2019 International Conference on Management of Data (SIGMOD)</w:t>
       </w:r>
       <w:r>
@@ -12197,7 +13391,7 @@
       <w:r>
         <w:t xml:space="preserve"> </w:t>
       </w:r>
-      <w:hyperlink r:id="rId80">
+      <w:hyperlink r:id="rId114">
         <w:r>
           <w:rPr>
             <w:rStyle w:val="Hyperlink"/>
@@ -12206,14 +13400,14 @@
         </w:r>
       </w:hyperlink>
     </w:p>
-    <w:bookmarkEnd w:id="81"/>
-    <w:bookmarkStart w:id="83" w:name="ref-roberts2017"/>
+    <w:bookmarkEnd w:id="115"/>
+    <w:bookmarkStart w:id="117" w:name="ref-reichstein2019"/>
     <w:p>
       <w:pPr>
         <w:pStyle w:val="Bibliography"/>
       </w:pPr>
       <w:r>
-        <w:t xml:space="preserve">Roberts, D. R., Bahn, V., Ciuti, S., Boyce, M. S., Elith, J., Guillera-Arroita, G., Hauenstein, S., Lahoz-Monfort, J. J., Schröder, B., Thuiller, W., Warton, D. I., Wintle, B. A., Hartig, F., &amp; Dormann, C. F. (2017). Cross-validation strategies for data with spatial, temporal, or phylogenetic structure.</w:t>
+        <w:t xml:space="preserve">Reichstein, M., Camps-Valls, G., Stevens, B., Jung, M., Denzler, J., Carvalhais, N., &amp; Prabhat. (2019). Deep learning and process understanding for Earth system science.</w:t>
       </w:r>
       <w:r>
         <w:t xml:space="preserve"> </w:t>
@@ -12223,7 +13417,7 @@
           <w:i/>
           <w:iCs/>
         </w:rPr>
-        <w:t xml:space="preserve">Ecography</w:t>
+        <w:t xml:space="preserve">Nature</w:t>
       </w:r>
       <w:r>
         <w:t xml:space="preserve">,</w:t>
@@ -12236,6 +13430,53 @@
           <w:i/>
           <w:iCs/>
         </w:rPr>
+        <w:t xml:space="preserve">566</w:t>
+      </w:r>
+      <w:r>
+        <w:t xml:space="preserve">(7743), 195-204.</w:t>
+      </w:r>
+      <w:r>
+        <w:t xml:space="preserve"> </w:t>
+      </w:r>
+      <w:hyperlink r:id="rId116">
+        <w:r>
+          <w:rPr>
+            <w:rStyle w:val="Hyperlink"/>
+          </w:rPr>
+          <w:t xml:space="preserve">https://doi.org/10.1038/s41586-019-0912-1</w:t>
+        </w:r>
+      </w:hyperlink>
+    </w:p>
+    <w:bookmarkEnd w:id="117"/>
+    <w:bookmarkStart w:id="119" w:name="ref-roberts2017"/>
+    <w:p>
+      <w:pPr>
+        <w:pStyle w:val="Bibliography"/>
+      </w:pPr>
+      <w:r>
+        <w:t xml:space="preserve">Roberts, D. R., Bahn, V., Ciuti, S., Boyce, M. S., Elith, J., Guillera-Arroita, G., Hauenstein, S., Lahoz-Monfort, J. J., Schröder, B., Thuiller, W., Warton, D. I., Wintle, B. A., Hartig, F., &amp; Dormann, C. F. (2017). Cross-validation strategies for data with spatial, temporal, or phylogenetic structure.</w:t>
+      </w:r>
+      <w:r>
+        <w:t xml:space="preserve"> </w:t>
+      </w:r>
+      <w:r>
+        <w:rPr>
+          <w:i/>
+          <w:iCs/>
+        </w:rPr>
+        <w:t xml:space="preserve">Ecography</w:t>
+      </w:r>
+      <w:r>
+        <w:t xml:space="preserve">,</w:t>
+      </w:r>
+      <w:r>
+        <w:t xml:space="preserve"> </w:t>
+      </w:r>
+      <w:r>
+        <w:rPr>
+          <w:i/>
+          <w:iCs/>
+        </w:rPr>
         <w:t xml:space="preserve">40</w:t>
       </w:r>
       <w:r>
@@ -12244,7 +13485,7 @@
       <w:r>
         <w:t xml:space="preserve"> </w:t>
       </w:r>
-      <w:hyperlink r:id="rId82">
+      <w:hyperlink r:id="rId118">
         <w:r>
           <w:rPr>
             <w:rStyle w:val="Hyperlink"/>
@@ -12253,20 +13494,14 @@
         </w:r>
       </w:hyperlink>
     </w:p>
-    <w:bookmarkEnd w:id="83"/>
-    <w:bookmarkStart w:id="85" w:name="ref-sanmiguel2012"/>
+    <w:bookmarkEnd w:id="119"/>
+    <w:bookmarkStart w:id="121" w:name="ref-rodrigues2014"/>
     <w:p>
       <w:pPr>
         <w:pStyle w:val="Bibliography"/>
       </w:pPr>
       <w:r>
-        <w:t xml:space="preserve">San-Miguel-Ayanz, J., Schulte, E., Schmuck, G., Camia, A., Strobl, P., Liberta, G., Giovando, C., Boca, R., Sedano, F., Kempeneers, P., McInerney, D., &amp; Houston Durrant, T. (2012). Comprehensive Monitoring of Wildfires in Europe: The European Forest Fire Information System (</w:t>
-      </w:r>
-      <w:r>
-        <w:t xml:space="preserve">EFFIS</w:t>
-      </w:r>
-      <w:r>
-        <w:t xml:space="preserve">).</w:t>
+        <w:t xml:space="preserve">Rodrigues, M., &amp; Riva, J. de la. (2014). An insight into machine-learning algorithms to model human-caused wildfire occurrence.</w:t>
       </w:r>
       <w:r>
         <w:t xml:space="preserve"> </w:t>
@@ -12276,6 +13511,144 @@
           <w:i/>
           <w:iCs/>
         </w:rPr>
+        <w:t xml:space="preserve">Environmental Modelling &amp; Software</w:t>
+      </w:r>
+      <w:r>
+        <w:t xml:space="preserve">,</w:t>
+      </w:r>
+      <w:r>
+        <w:t xml:space="preserve"> </w:t>
+      </w:r>
+      <w:r>
+        <w:rPr>
+          <w:i/>
+          <w:iCs/>
+        </w:rPr>
+        <w:t xml:space="preserve">57</w:t>
+      </w:r>
+      <w:r>
+        <w:t xml:space="preserve">, 192-201.</w:t>
+      </w:r>
+      <w:r>
+        <w:t xml:space="preserve"> </w:t>
+      </w:r>
+      <w:hyperlink r:id="rId120">
+        <w:r>
+          <w:rPr>
+            <w:rStyle w:val="Hyperlink"/>
+          </w:rPr>
+          <w:t xml:space="preserve">https://doi.org/10.1016/j.envsoft.2014.03.003</w:t>
+        </w:r>
+      </w:hyperlink>
+    </w:p>
+    <w:bookmarkEnd w:id="121"/>
+    <w:bookmarkStart w:id="122" w:name="ref-rothermel1972"/>
+    <w:p>
+      <w:pPr>
+        <w:pStyle w:val="Bibliography"/>
+      </w:pPr>
+      <w:r>
+        <w:t xml:space="preserve">Rothermel, R. C. (1972).</w:t>
+      </w:r>
+      <w:r>
+        <w:t xml:space="preserve"> </w:t>
+      </w:r>
+      <w:r>
+        <w:rPr>
+          <w:i/>
+          <w:iCs/>
+        </w:rPr>
+        <w:t xml:space="preserve">A mathematical model for predicting fire spread in wildland fuels</w:t>
+      </w:r>
+      <w:r>
+        <w:t xml:space="preserve"> </w:t>
+      </w:r>
+      <w:r>
+        <w:t xml:space="preserve">(INT-115; USDA Forest Service Research Paper, pp. 1-40). Intermountain Forest; Range Experiment Station, Forest Service, U.S. Department of Agriculture.</w:t>
+      </w:r>
+    </w:p>
+    <w:bookmarkEnd w:id="122"/>
+    <w:bookmarkStart w:id="124" w:name="ref-roy2008"/>
+    <w:p>
+      <w:pPr>
+        <w:pStyle w:val="Bibliography"/>
+      </w:pPr>
+      <w:r>
+        <w:t xml:space="preserve">Roy, D. P., Boschetti, L., Justice, C. O., &amp; Ju, J. (2008). The Collection 5</w:t>
+      </w:r>
+      <w:r>
+        <w:t xml:space="preserve"> </w:t>
+      </w:r>
+      <w:r>
+        <w:t xml:space="preserve">MODIS</w:t>
+      </w:r>
+      <w:r>
+        <w:t xml:space="preserve"> </w:t>
+      </w:r>
+      <w:r>
+        <w:t xml:space="preserve">burned area product—Global evaluation by comparison with the Collection 4 product.</w:t>
+      </w:r>
+      <w:r>
+        <w:t xml:space="preserve"> </w:t>
+      </w:r>
+      <w:r>
+        <w:rPr>
+          <w:i/>
+          <w:iCs/>
+        </w:rPr>
+        <w:t xml:space="preserve">Remote Sensing of Environment</w:t>
+      </w:r>
+      <w:r>
+        <w:t xml:space="preserve">,</w:t>
+      </w:r>
+      <w:r>
+        <w:t xml:space="preserve"> </w:t>
+      </w:r>
+      <w:r>
+        <w:rPr>
+          <w:i/>
+          <w:iCs/>
+        </w:rPr>
+        <w:t xml:space="preserve">112</w:t>
+      </w:r>
+      <w:r>
+        <w:t xml:space="preserve">(9), 3690-3707.</w:t>
+      </w:r>
+      <w:r>
+        <w:t xml:space="preserve"> </w:t>
+      </w:r>
+      <w:hyperlink r:id="rId123">
+        <w:r>
+          <w:rPr>
+            <w:rStyle w:val="Hyperlink"/>
+          </w:rPr>
+          <w:t xml:space="preserve">https://doi.org/10.1016/j.rse.2008.05.013</w:t>
+        </w:r>
+      </w:hyperlink>
+    </w:p>
+    <w:bookmarkEnd w:id="124"/>
+    <w:bookmarkStart w:id="126" w:name="ref-sanmiguel2012"/>
+    <w:p>
+      <w:pPr>
+        <w:pStyle w:val="Bibliography"/>
+      </w:pPr>
+      <w:r>
+        <w:t xml:space="preserve">San-Miguel-Ayanz, J., Schulte, E., Schmuck, G., Camia, A., Strobl, P., Liberta, G., Giovando, C., Boca, R., Sedano, F., Kempeneers, P., McInerney, D., &amp; Houston Durrant, T. (2012). Comprehensive Monitoring of Wildfires in Europe: The European Forest Fire Information System (</w:t>
+      </w:r>
+      <w:r>
+        <w:t xml:space="preserve">EFFIS</w:t>
+      </w:r>
+      <w:r>
+        <w:t xml:space="preserve">).</w:t>
+      </w:r>
+      <w:r>
+        <w:t xml:space="preserve"> </w:t>
+      </w:r>
+      <w:r>
+        <w:rPr>
+          <w:i/>
+          <w:iCs/>
+        </w:rPr>
         <w:t xml:space="preserve">Approaches to Managing Disaster - Assessing Hazards, Emergencies and Disaster Impacts</w:t>
       </w:r>
       <w:r>
@@ -12284,7 +13657,7 @@
       <w:r>
         <w:t xml:space="preserve"> </w:t>
       </w:r>
-      <w:hyperlink r:id="rId84">
+      <w:hyperlink r:id="rId125">
         <w:r>
           <w:rPr>
             <w:rStyle w:val="Hyperlink"/>
@@ -12293,26 +13666,14 @@
         </w:r>
       </w:hyperlink>
     </w:p>
-    <w:bookmarkEnd w:id="85"/>
-    <w:bookmarkStart w:id="87" w:name="ref-schroeder2014"/>
+    <w:bookmarkEnd w:id="126"/>
+    <w:bookmarkStart w:id="128" w:name="ref-sayad2019"/>
     <w:p>
       <w:pPr>
         <w:pStyle w:val="Bibliography"/>
       </w:pPr>
       <w:r>
-        <w:t xml:space="preserve">Schroeder, W., Oliva, P., Giglio, L., &amp; Csiszar, I. A. (2014). The New</w:t>
-      </w:r>
-      <w:r>
-        <w:t xml:space="preserve"> </w:t>
-      </w:r>
-      <w:r>
-        <w:t xml:space="preserve">VIIRS</w:t>
-      </w:r>
-      <w:r>
-        <w:t xml:space="preserve"> </w:t>
-      </w:r>
-      <w:r>
-        <w:t xml:space="preserve">375 m active fire detection data product: Algorithm description and initial assessment.</w:t>
+        <w:t xml:space="preserve">Sayad, Y. O., Mousannif, H., &amp; Al Moatassime, H. (2019). Predictive modeling of wildland fires: A new dataset and machine learning approach.</w:t>
       </w:r>
       <w:r>
         <w:t xml:space="preserve"> </w:t>
@@ -12322,7 +13683,7 @@
           <w:i/>
           <w:iCs/>
         </w:rPr>
-        <w:t xml:space="preserve">Remote Sensing of Environment</w:t>
+        <w:t xml:space="preserve">Fire Safety Journal</w:t>
       </w:r>
       <w:r>
         <w:t xml:space="preserve">,</w:t>
@@ -12335,6 +13696,65 @@
           <w:i/>
           <w:iCs/>
         </w:rPr>
+        <w:t xml:space="preserve">104</w:t>
+      </w:r>
+      <w:r>
+        <w:t xml:space="preserve">, 130-146.</w:t>
+      </w:r>
+      <w:r>
+        <w:t xml:space="preserve"> </w:t>
+      </w:r>
+      <w:hyperlink r:id="rId127">
+        <w:r>
+          <w:rPr>
+            <w:rStyle w:val="Hyperlink"/>
+          </w:rPr>
+          <w:t xml:space="preserve">https://doi.org/10.1016/j.firesaf.2019.01.006</w:t>
+        </w:r>
+      </w:hyperlink>
+    </w:p>
+    <w:bookmarkEnd w:id="128"/>
+    <w:bookmarkStart w:id="130" w:name="ref-schroeder2014"/>
+    <w:p>
+      <w:pPr>
+        <w:pStyle w:val="Bibliography"/>
+      </w:pPr>
+      <w:r>
+        <w:t xml:space="preserve">Schroeder, W., Oliva, P., Giglio, L., &amp; Csiszar, I. A. (2014). The New</w:t>
+      </w:r>
+      <w:r>
+        <w:t xml:space="preserve"> </w:t>
+      </w:r>
+      <w:r>
+        <w:t xml:space="preserve">VIIRS</w:t>
+      </w:r>
+      <w:r>
+        <w:t xml:space="preserve"> </w:t>
+      </w:r>
+      <w:r>
+        <w:t xml:space="preserve">375 m active fire detection data product: Algorithm description and initial assessment.</w:t>
+      </w:r>
+      <w:r>
+        <w:t xml:space="preserve"> </w:t>
+      </w:r>
+      <w:r>
+        <w:rPr>
+          <w:i/>
+          <w:iCs/>
+        </w:rPr>
+        <w:t xml:space="preserve">Remote Sensing of Environment</w:t>
+      </w:r>
+      <w:r>
+        <w:t xml:space="preserve">,</w:t>
+      </w:r>
+      <w:r>
+        <w:t xml:space="preserve"> </w:t>
+      </w:r>
+      <w:r>
+        <w:rPr>
+          <w:i/>
+          <w:iCs/>
+        </w:rPr>
         <w:t xml:space="preserve">143</w:t>
       </w:r>
       <w:r>
@@ -12343,7 +13763,7 @@
       <w:r>
         <w:t xml:space="preserve"> </w:t>
       </w:r>
-      <w:hyperlink r:id="rId86">
+      <w:hyperlink r:id="rId129">
         <w:r>
           <w:rPr>
             <w:rStyle w:val="Hyperlink"/>
@@ -12352,8 +13772,8 @@
         </w:r>
       </w:hyperlink>
     </w:p>
-    <w:bookmarkEnd w:id="87"/>
-    <w:bookmarkStart w:id="89" w:name="ref-setzer2019"/>
+    <w:bookmarkEnd w:id="130"/>
+    <w:bookmarkStart w:id="132" w:name="ref-setzer2019"/>
     <w:p>
       <w:pPr>
         <w:pStyle w:val="Bibliography"/>
@@ -12447,7 +13867,7 @@
       <w:r>
         <w:t xml:space="preserve"> </w:t>
       </w:r>
-      <w:hyperlink r:id="rId88">
+      <w:hyperlink r:id="rId131">
         <w:r>
           <w:rPr>
             <w:rStyle w:val="Hyperlink"/>
@@ -12456,8 +13876,8 @@
         </w:r>
       </w:hyperlink>
     </w:p>
-    <w:bookmarkEnd w:id="89"/>
-    <w:bookmarkStart w:id="91" w:name="ref-stocks1989"/>
+    <w:bookmarkEnd w:id="132"/>
+    <w:bookmarkStart w:id="134" w:name="ref-stocks1989"/>
     <w:p>
       <w:pPr>
         <w:pStyle w:val="Bibliography"/>
@@ -12494,7 +13914,7 @@
       <w:r>
         <w:t xml:space="preserve"> </w:t>
       </w:r>
-      <w:hyperlink r:id="rId90">
+      <w:hyperlink r:id="rId133">
         <w:r>
           <w:rPr>
             <w:rStyle w:val="Hyperlink"/>
@@ -12503,14 +13923,14 @@
         </w:r>
       </w:hyperlink>
     </w:p>
-    <w:bookmarkEnd w:id="91"/>
-    <w:bookmarkStart w:id="93" w:name="ref-vallejos2015"/>
+    <w:bookmarkEnd w:id="134"/>
+    <w:bookmarkStart w:id="136" w:name="ref-tobler1970"/>
     <w:p>
       <w:pPr>
         <w:pStyle w:val="Bibliography"/>
       </w:pPr>
       <w:r>
-        <w:t xml:space="preserve">Vallejos, M., Volante, J. N., Mosciaro, M. J., Vale, L. M., Bustamante, M. L., &amp; Paruelo, J. M. (2015). Transformation dynamics of the natural cover in the Dry Chaco ecoregion: A plot level geo-database from 1976 to 2012.</w:t>
+        <w:t xml:space="preserve">Tobler, W. R. (1970). A computer movie simulating urban growth in the Detroit region.</w:t>
       </w:r>
       <w:r>
         <w:t xml:space="preserve"> </w:t>
@@ -12520,7 +13940,7 @@
           <w:i/>
           <w:iCs/>
         </w:rPr>
-        <w:t xml:space="preserve">Journal of Arid Environments</w:t>
+        <w:t xml:space="preserve">Economic Geography</w:t>
       </w:r>
       <w:r>
         <w:t xml:space="preserve">,</w:t>
@@ -12533,6 +13953,53 @@
           <w:i/>
           <w:iCs/>
         </w:rPr>
+        <w:t xml:space="preserve">46</w:t>
+      </w:r>
+      <w:r>
+        <w:t xml:space="preserve">(sup1), 234-240.</w:t>
+      </w:r>
+      <w:r>
+        <w:t xml:space="preserve"> </w:t>
+      </w:r>
+      <w:hyperlink r:id="rId135">
+        <w:r>
+          <w:rPr>
+            <w:rStyle w:val="Hyperlink"/>
+          </w:rPr>
+          <w:t xml:space="preserve">https://doi.org/10.2307/143141</w:t>
+        </w:r>
+      </w:hyperlink>
+    </w:p>
+    <w:bookmarkEnd w:id="136"/>
+    <w:bookmarkStart w:id="138" w:name="ref-vallejos2015"/>
+    <w:p>
+      <w:pPr>
+        <w:pStyle w:val="Bibliography"/>
+      </w:pPr>
+      <w:r>
+        <w:t xml:space="preserve">Vallejos, M., Volante, J. N., Mosciaro, M. J., Vale, L. M., Bustamante, M. L., &amp; Paruelo, J. M. (2015). Transformation dynamics of the natural cover in the Dry Chaco ecoregion: A plot level geo-database from 1976 to 2012.</w:t>
+      </w:r>
+      <w:r>
+        <w:t xml:space="preserve"> </w:t>
+      </w:r>
+      <w:r>
+        <w:rPr>
+          <w:i/>
+          <w:iCs/>
+        </w:rPr>
+        <w:t xml:space="preserve">Journal of Arid Environments</w:t>
+      </w:r>
+      <w:r>
+        <w:t xml:space="preserve">,</w:t>
+      </w:r>
+      <w:r>
+        <w:t xml:space="preserve"> </w:t>
+      </w:r>
+      <w:r>
+        <w:rPr>
+          <w:i/>
+          <w:iCs/>
+        </w:rPr>
         <w:t xml:space="preserve">123</w:t>
       </w:r>
       <w:r>
@@ -12541,7 +14008,7 @@
       <w:r>
         <w:t xml:space="preserve"> </w:t>
       </w:r>
-      <w:hyperlink r:id="rId92">
+      <w:hyperlink r:id="rId137">
         <w:r>
           <w:rPr>
             <w:rStyle w:val="Hyperlink"/>
@@ -12550,8 +14017,8 @@
         </w:r>
       </w:hyperlink>
     </w:p>
-    <w:bookmarkEnd w:id="93"/>
-    <w:bookmarkStart w:id="94" w:name="ref-vanwagner1987"/>
+    <w:bookmarkEnd w:id="138"/>
+    <w:bookmarkStart w:id="139" w:name="ref-vanwagner1987"/>
     <w:p>
       <w:pPr>
         <w:pStyle w:val="Bibliography"/>
@@ -12586,9 +14053,109 @@
         <w:t xml:space="preserve">, 1-37.</w:t>
       </w:r>
     </w:p>
-    <w:bookmarkEnd w:id="94"/>
-    <w:bookmarkEnd w:id="95"/>
-    <w:bookmarkEnd w:id="96"/>
+    <w:bookmarkEnd w:id="139"/>
+    <w:bookmarkStart w:id="141" w:name="ref-willard2022"/>
+    <w:p>
+      <w:pPr>
+        <w:pStyle w:val="Bibliography"/>
+      </w:pPr>
+      <w:r>
+        <w:t xml:space="preserve">Willard, J., Jia, X., Xu, S., Steinbach, M., &amp; Kumar, V. (2022). Integrating Scientific Knowledge with Machine Learning for Engineering and Environmental Systems.</w:t>
+      </w:r>
+      <w:r>
+        <w:t xml:space="preserve"> </w:t>
+      </w:r>
+      <w:r>
+        <w:rPr>
+          <w:i/>
+          <w:iCs/>
+        </w:rPr>
+        <w:t xml:space="preserve">ACM Computing Surveys</w:t>
+      </w:r>
+      <w:r>
+        <w:t xml:space="preserve">,</w:t>
+      </w:r>
+      <w:r>
+        <w:t xml:space="preserve"> </w:t>
+      </w:r>
+      <w:r>
+        <w:rPr>
+          <w:i/>
+          <w:iCs/>
+        </w:rPr>
+        <w:t xml:space="preserve">55</w:t>
+      </w:r>
+      <w:r>
+        <w:t xml:space="preserve">(4), 1-37.</w:t>
+      </w:r>
+      <w:r>
+        <w:t xml:space="preserve"> </w:t>
+      </w:r>
+      <w:hyperlink r:id="rId140">
+        <w:r>
+          <w:rPr>
+            <w:rStyle w:val="Hyperlink"/>
+          </w:rPr>
+          <w:t xml:space="preserve">https://doi.org/10.1145/3514228</w:t>
+        </w:r>
+      </w:hyperlink>
+    </w:p>
+    <w:bookmarkEnd w:id="141"/>
+    <w:bookmarkStart w:id="143" w:name="ref-wooster2005"/>
+    <w:p>
+      <w:pPr>
+        <w:pStyle w:val="Bibliography"/>
+      </w:pPr>
+      <w:r>
+        <w:t xml:space="preserve">Wooster, M. J., Roberts, G., Perry, G. L. W., &amp; Kaufman, Y. J. (2005). Retrieval of biomass combustion rates and fuel consumption from multi-spectral satellite imagery (</w:t>
+      </w:r>
+      <w:r>
+        <w:t xml:space="preserve">FRP</w:t>
+      </w:r>
+      <w:r>
+        <w:t xml:space="preserve">): An update.</w:t>
+      </w:r>
+      <w:r>
+        <w:t xml:space="preserve"> </w:t>
+      </w:r>
+      <w:r>
+        <w:rPr>
+          <w:i/>
+          <w:iCs/>
+        </w:rPr>
+        <w:t xml:space="preserve">Journal of Geophysical Research: Atmospheres</w:t>
+      </w:r>
+      <w:r>
+        <w:t xml:space="preserve">,</w:t>
+      </w:r>
+      <w:r>
+        <w:t xml:space="preserve"> </w:t>
+      </w:r>
+      <w:r>
+        <w:rPr>
+          <w:i/>
+          <w:iCs/>
+        </w:rPr>
+        <w:t xml:space="preserve">110</w:t>
+      </w:r>
+      <w:r>
+        <w:t xml:space="preserve">(D24), D24311.</w:t>
+      </w:r>
+      <w:r>
+        <w:t xml:space="preserve"> </w:t>
+      </w:r>
+      <w:hyperlink r:id="rId142">
+        <w:r>
+          <w:rPr>
+            <w:rStyle w:val="Hyperlink"/>
+          </w:rPr>
+          <w:t xml:space="preserve">https://doi.org/10.1029/2005JD006318</w:t>
+        </w:r>
+      </w:hyperlink>
+    </w:p>
+    <w:bookmarkEnd w:id="143"/>
+    <w:bookmarkEnd w:id="144"/>
+    <w:bookmarkEnd w:id="145"/>
     <w:sectPr>
       <w:footnotePr>
         <w:numRestart w:val="eachSect"/>

</xml_diff>